<commit_message>
Añadi un documento llamado SentinelPLD_resumen, el cual es la recopilación hasta el momento de lo que se tiene pensado hacer en la tesina
</commit_message>
<xml_diff>
--- a/Revisiones-Tesina/Delimitacion-Del-Problema/Revisado/ANTEPROYECTO AV1 GUSTAVO DE JESUS ESCOBAR MATA.docx
+++ b/Revisiones-Tesina/Delimitacion-Del-Problema/Revisado/ANTEPROYECTO AV1 GUSTAVO DE JESUS ESCOBAR MATA.docx
@@ -801,7 +801,39 @@
           <w:rFonts w:ascii="Arial" w:hAnsi="Arial" w:cs="Arial"/>
           <w:lang w:val="es-ES"/>
         </w:rPr>
-        <w:t>(Título y nombre)                                         (Título y nombre)</w:t>
+        <w:t xml:space="preserve">(Título y </w:t>
+      </w:r>
+      <w:proofErr w:type="gramStart"/>
+      <w:r>
+        <w:rPr>
+          <w:rFonts w:ascii="Arial" w:hAnsi="Arial" w:cs="Arial"/>
+          <w:lang w:val="es-ES"/>
+        </w:rPr>
+        <w:t xml:space="preserve">nombre)   </w:t>
+      </w:r>
+      <w:proofErr w:type="gramEnd"/>
+      <w:r>
+        <w:rPr>
+          <w:rFonts w:ascii="Arial" w:hAnsi="Arial" w:cs="Arial"/>
+          <w:lang w:val="es-ES"/>
+        </w:rPr>
+        <w:t xml:space="preserve">                                   </w:t>
+      </w:r>
+      <w:proofErr w:type="gramStart"/>
+      <w:r>
+        <w:rPr>
+          <w:rFonts w:ascii="Arial" w:hAnsi="Arial" w:cs="Arial"/>
+          <w:lang w:val="es-ES"/>
+        </w:rPr>
+        <w:t xml:space="preserve">   (</w:t>
+      </w:r>
+      <w:proofErr w:type="gramEnd"/>
+      <w:r>
+        <w:rPr>
+          <w:rFonts w:ascii="Arial" w:hAnsi="Arial" w:cs="Arial"/>
+          <w:lang w:val="es-ES"/>
+        </w:rPr>
+        <w:t>Título y nombre)</w:t>
       </w:r>
     </w:p>
     <w:p>
@@ -1417,7 +1449,139 @@
         <w:rPr>
           <w:rFonts w:ascii="Arial" w:hAnsi="Arial" w:cs="Arial"/>
         </w:rPr>
-        <w:t>(Subtítulo)…………</w:t>
+        <w:t>(Subtítulo)……</w:t>
+      </w:r>
+      <w:proofErr w:type="gramStart"/>
+      <w:r>
+        <w:rPr>
+          <w:rFonts w:ascii="Arial" w:hAnsi="Arial" w:cs="Arial"/>
+        </w:rPr>
+        <w:t>……</w:t>
+      </w:r>
+      <w:r>
+        <w:rPr>
+          <w:rFonts w:ascii="Arial" w:hAnsi="Arial" w:cs="Arial"/>
+        </w:rPr>
+        <w:t>.</w:t>
+      </w:r>
+      <w:proofErr w:type="gramEnd"/>
+      <w:r>
+        <w:rPr>
+          <w:rFonts w:ascii="Arial" w:hAnsi="Arial" w:cs="Arial"/>
+        </w:rPr>
+        <w:t>.</w:t>
+      </w:r>
+      <w:r>
+        <w:rPr>
+          <w:rFonts w:ascii="Arial" w:hAnsi="Arial" w:cs="Arial"/>
+        </w:rPr>
+        <w:t>……………………………………</w:t>
+      </w:r>
+      <w:r>
+        <w:rPr>
+          <w:rFonts w:ascii="Arial" w:hAnsi="Arial" w:cs="Arial"/>
+        </w:rPr>
+        <w:t>……</w:t>
+      </w:r>
+      <w:proofErr w:type="gramStart"/>
+      <w:r>
+        <w:rPr>
+          <w:rFonts w:ascii="Arial" w:hAnsi="Arial" w:cs="Arial"/>
+        </w:rPr>
+        <w:t>…….</w:t>
+      </w:r>
+      <w:proofErr w:type="gramEnd"/>
+      <w:r>
+        <w:rPr>
+          <w:rFonts w:ascii="Arial" w:hAnsi="Arial" w:cs="Arial"/>
+        </w:rPr>
+        <w:t>1</w:t>
+      </w:r>
+    </w:p>
+    <w:p>
+      <w:pPr>
+        <w:rPr>
+          <w:rFonts w:ascii="Arial" w:hAnsi="Arial" w:cs="Arial"/>
+        </w:rPr>
+      </w:pPr>
+      <w:r>
+        <w:rPr>
+          <w:rFonts w:ascii="Arial" w:hAnsi="Arial" w:cs="Arial"/>
+          <w:lang w:val="es-ES"/>
+        </w:rPr>
+        <w:tab/>
+      </w:r>
+      <w:r>
+        <w:rPr>
+          <w:rFonts w:ascii="Arial" w:hAnsi="Arial" w:cs="Arial"/>
+        </w:rPr>
+        <w:t xml:space="preserve">           1.1.1 (Subtítulo)………………………………</w:t>
+      </w:r>
+      <w:r>
+        <w:rPr>
+          <w:rFonts w:ascii="Arial" w:hAnsi="Arial" w:cs="Arial"/>
+        </w:rPr>
+        <w:t>………………</w:t>
+      </w:r>
+      <w:proofErr w:type="gramStart"/>
+      <w:r>
+        <w:rPr>
+          <w:rFonts w:ascii="Arial" w:hAnsi="Arial" w:cs="Arial"/>
+        </w:rPr>
+        <w:t>……</w:t>
+      </w:r>
+      <w:r>
+        <w:rPr>
+          <w:rFonts w:ascii="Arial" w:hAnsi="Arial" w:cs="Arial"/>
+        </w:rPr>
+        <w:t>.</w:t>
+      </w:r>
+      <w:proofErr w:type="gramEnd"/>
+      <w:r>
+        <w:rPr>
+          <w:rFonts w:ascii="Arial" w:hAnsi="Arial" w:cs="Arial"/>
+        </w:rPr>
+        <w:t>1</w:t>
+      </w:r>
+    </w:p>
+    <w:p>
+      <w:pPr>
+        <w:rPr>
+          <w:rFonts w:ascii="Arial" w:hAnsi="Arial" w:cs="Arial"/>
+        </w:rPr>
+      </w:pPr>
+      <w:r>
+        <w:rPr>
+          <w:rFonts w:ascii="Arial" w:hAnsi="Arial" w:cs="Arial"/>
+        </w:rPr>
+        <w:t xml:space="preserve">             1.2</w:t>
+      </w:r>
+      <w:proofErr w:type="gramStart"/>
+      <w:r>
+        <w:rPr>
+          <w:rFonts w:ascii="Arial" w:hAnsi="Arial" w:cs="Arial"/>
+        </w:rPr>
+        <w:t xml:space="preserve">   (</w:t>
+      </w:r>
+      <w:proofErr w:type="gramEnd"/>
+      <w:r>
+        <w:rPr>
+          <w:rFonts w:ascii="Arial" w:hAnsi="Arial" w:cs="Arial"/>
+        </w:rPr>
+        <w:t>Subtítulo)……………………………………………………</w:t>
+      </w:r>
+      <w:r>
+        <w:rPr>
+          <w:rFonts w:ascii="Arial" w:hAnsi="Arial" w:cs="Arial"/>
+        </w:rPr>
+        <w:t>…</w:t>
+      </w:r>
+      <w:proofErr w:type="gramStart"/>
+      <w:r>
+        <w:rPr>
+          <w:rFonts w:ascii="Arial" w:hAnsi="Arial" w:cs="Arial"/>
+        </w:rPr>
+        <w:t>….</w:t>
       </w:r>
       <w:r>
         <w:rPr>
@@ -1429,95 +1593,9 @@
         <w:rPr>
           <w:rFonts w:ascii="Arial" w:hAnsi="Arial" w:cs="Arial"/>
         </w:rPr>
-        <w:t>……………………………………</w:t>
-      </w:r>
-      <w:r>
-        <w:rPr>
-          <w:rFonts w:ascii="Arial" w:hAnsi="Arial" w:cs="Arial"/>
-        </w:rPr>
-        <w:t>……</w:t>
-      </w:r>
-      <w:r>
-        <w:rPr>
-          <w:rFonts w:ascii="Arial" w:hAnsi="Arial" w:cs="Arial"/>
-        </w:rPr>
-        <w:t>…….</w:t>
-      </w:r>
-      <w:r>
-        <w:rPr>
-          <w:rFonts w:ascii="Arial" w:hAnsi="Arial" w:cs="Arial"/>
-        </w:rPr>
-        <w:t>1</w:t>
-      </w:r>
-    </w:p>
-    <w:p>
-      <w:pPr>
-        <w:rPr>
-          <w:rFonts w:ascii="Arial" w:hAnsi="Arial" w:cs="Arial"/>
-        </w:rPr>
-      </w:pPr>
-      <w:r>
-        <w:rPr>
-          <w:rFonts w:ascii="Arial" w:hAnsi="Arial" w:cs="Arial"/>
-          <w:lang w:val="es-ES"/>
-        </w:rPr>
-        <w:tab/>
-      </w:r>
-      <w:r>
-        <w:rPr>
-          <w:rFonts w:ascii="Arial" w:hAnsi="Arial" w:cs="Arial"/>
-        </w:rPr>
-        <w:t xml:space="preserve">           1.1.1 (Subtítulo)………………………………</w:t>
-      </w:r>
-      <w:r>
-        <w:rPr>
-          <w:rFonts w:ascii="Arial" w:hAnsi="Arial" w:cs="Arial"/>
-        </w:rPr>
-        <w:t>……………………</w:t>
-      </w:r>
-      <w:r>
-        <w:rPr>
-          <w:rFonts w:ascii="Arial" w:hAnsi="Arial" w:cs="Arial"/>
-        </w:rPr>
         <w:t>.</w:t>
       </w:r>
-      <w:r>
-        <w:rPr>
-          <w:rFonts w:ascii="Arial" w:hAnsi="Arial" w:cs="Arial"/>
-        </w:rPr>
-        <w:t>1</w:t>
-      </w:r>
-    </w:p>
-    <w:p>
-      <w:pPr>
-        <w:rPr>
-          <w:rFonts w:ascii="Arial" w:hAnsi="Arial" w:cs="Arial"/>
-        </w:rPr>
-      </w:pPr>
-      <w:r>
-        <w:rPr>
-          <w:rFonts w:ascii="Arial" w:hAnsi="Arial" w:cs="Arial"/>
-        </w:rPr>
-        <w:t xml:space="preserve">             1.2   (Subtítulo)……………………………………………………</w:t>
-      </w:r>
-      <w:r>
-        <w:rPr>
-          <w:rFonts w:ascii="Arial" w:hAnsi="Arial" w:cs="Arial"/>
-        </w:rPr>
-        <w:t>…….</w:t>
-      </w:r>
-      <w:r>
-        <w:rPr>
-          <w:rFonts w:ascii="Arial" w:hAnsi="Arial" w:cs="Arial"/>
-        </w:rPr>
-        <w:t>..</w:t>
-      </w:r>
-      <w:r>
-        <w:rPr>
-          <w:rFonts w:ascii="Arial" w:hAnsi="Arial" w:cs="Arial"/>
-        </w:rPr>
-        <w:t>.</w:t>
-      </w:r>
+      <w:proofErr w:type="gramEnd"/>
       <w:r>
         <w:rPr>
           <w:rFonts w:ascii="Arial" w:hAnsi="Arial" w:cs="Arial"/>
@@ -1633,7 +1711,15 @@
           <w:rFonts w:ascii="Arial" w:hAnsi="Arial" w:cs="Arial"/>
           <w:lang w:val="es-ES"/>
         </w:rPr>
-        <w:t xml:space="preserve">2.1  </w:t>
+        <w:t>2.1</w:t>
+      </w:r>
+      <w:proofErr w:type="gramStart"/>
+      <w:r>
+        <w:rPr>
+          <w:rFonts w:ascii="Arial" w:hAnsi="Arial" w:cs="Arial"/>
+          <w:lang w:val="es-ES"/>
+        </w:rPr>
+        <w:t xml:space="preserve">  </w:t>
       </w:r>
       <w:r>
         <w:rPr>
@@ -1647,7 +1733,15 @@
           <w:rFonts w:ascii="Arial" w:hAnsi="Arial" w:cs="Arial"/>
           <w:lang w:val="es-ES"/>
         </w:rPr>
-        <w:t xml:space="preserve">(Subtítulo) </w:t>
+        <w:t>(</w:t>
+      </w:r>
+      <w:proofErr w:type="gramEnd"/>
+      <w:r>
+        <w:rPr>
+          <w:rFonts w:ascii="Arial" w:hAnsi="Arial" w:cs="Arial"/>
+          <w:lang w:val="es-ES"/>
+        </w:rPr>
+        <w:t xml:space="preserve">Subtítulo) </w:t>
       </w:r>
       <w:r>
         <w:rPr>
@@ -1740,7 +1834,21 @@
         <w:rPr>
           <w:rFonts w:ascii="Arial" w:hAnsi="Arial" w:cs="Arial"/>
         </w:rPr>
-        <w:t>4.    FORMULACIÓN DE OBJETIVOS…………………………..…</w:t>
+        <w:t>4.    FORMULACIÓN DE OBJETIVOS……………………</w:t>
+      </w:r>
+      <w:proofErr w:type="gramStart"/>
+      <w:r>
+        <w:rPr>
+          <w:rFonts w:ascii="Arial" w:hAnsi="Arial" w:cs="Arial"/>
+        </w:rPr>
+        <w:t>…….</w:t>
+      </w:r>
+      <w:proofErr w:type="gramEnd"/>
+      <w:r>
+        <w:rPr>
+          <w:rFonts w:ascii="Arial" w:hAnsi="Arial" w:cs="Arial"/>
+        </w:rPr>
+        <w:t>.…</w:t>
       </w:r>
       <w:r>
         <w:rPr>
@@ -1817,14 +1925,36 @@
         <w:rPr>
           <w:rFonts w:ascii="Arial" w:hAnsi="Arial" w:cs="Arial"/>
         </w:rPr>
-        <w:t>6.    METODOLOGÍA………………………………………………....…</w:t>
-      </w:r>
-      <w:r>
-        <w:rPr>
-          <w:rFonts w:ascii="Arial" w:hAnsi="Arial" w:cs="Arial"/>
-        </w:rPr>
-        <w:t>………....</w:t>
-      </w:r>
+        <w:t>6.    METODOLOGÍA……………………………………………</w:t>
+      </w:r>
+      <w:proofErr w:type="gramStart"/>
+      <w:r>
+        <w:rPr>
+          <w:rFonts w:ascii="Arial" w:hAnsi="Arial" w:cs="Arial"/>
+        </w:rPr>
+        <w:t>…....</w:t>
+      </w:r>
+      <w:proofErr w:type="gramEnd"/>
+      <w:r>
+        <w:rPr>
+          <w:rFonts w:ascii="Arial" w:hAnsi="Arial" w:cs="Arial"/>
+        </w:rPr>
+        <w:t>…</w:t>
+      </w:r>
+      <w:r>
+        <w:rPr>
+          <w:rFonts w:ascii="Arial" w:hAnsi="Arial" w:cs="Arial"/>
+        </w:rPr>
+        <w:t>……</w:t>
+      </w:r>
+      <w:proofErr w:type="gramStart"/>
+      <w:r>
+        <w:rPr>
+          <w:rFonts w:ascii="Arial" w:hAnsi="Arial" w:cs="Arial"/>
+        </w:rPr>
+        <w:t>…....</w:t>
+      </w:r>
+      <w:proofErr w:type="gramEnd"/>
       <w:r>
         <w:rPr>
           <w:rFonts w:ascii="Arial" w:hAnsi="Arial" w:cs="Arial"/>
@@ -1971,7 +2101,21 @@
         <w:rPr>
           <w:rFonts w:ascii="Arial" w:hAnsi="Arial" w:cs="Arial"/>
         </w:rPr>
-        <w:t>…………………………………………….....……….......</w:t>
+        <w:t>…………………………………………</w:t>
+      </w:r>
+      <w:proofErr w:type="gramStart"/>
+      <w:r>
+        <w:rPr>
+          <w:rFonts w:ascii="Arial" w:hAnsi="Arial" w:cs="Arial"/>
+        </w:rPr>
+        <w:t>…....</w:t>
+      </w:r>
+      <w:proofErr w:type="gramEnd"/>
+      <w:r>
+        <w:rPr>
+          <w:rFonts w:ascii="Arial" w:hAnsi="Arial" w:cs="Arial"/>
+        </w:rPr>
+        <w:t>.……….......</w:t>
       </w:r>
       <w:r>
         <w:rPr>
@@ -2028,7 +2172,21 @@
         <w:rPr>
           <w:rFonts w:ascii="Arial" w:hAnsi="Arial" w:cs="Arial"/>
         </w:rPr>
-        <w:t>...........…………………………………………….....……….............</w:t>
+        <w:t>...........…………………………………………</w:t>
+      </w:r>
+      <w:proofErr w:type="gramStart"/>
+      <w:r>
+        <w:rPr>
+          <w:rFonts w:ascii="Arial" w:hAnsi="Arial" w:cs="Arial"/>
+        </w:rPr>
+        <w:t>…....</w:t>
+      </w:r>
+      <w:proofErr w:type="gramEnd"/>
+      <w:r>
+        <w:rPr>
+          <w:rFonts w:ascii="Arial" w:hAnsi="Arial" w:cs="Arial"/>
+        </w:rPr>
+        <w:t>.……….............</w:t>
       </w:r>
       <w:r>
         <w:rPr>
@@ -3954,6 +4112,12 @@
           <w:rFonts w:ascii="Arial" w:hAnsi="Arial" w:cs="Arial"/>
         </w:rPr>
         <w:tab/>
+      </w:r>
+      <w:proofErr w:type="gramStart"/>
+      <w:r>
+        <w:rPr>
+          <w:rFonts w:ascii="Arial" w:hAnsi="Arial" w:cs="Arial"/>
+        </w:rPr>
         <w:t>Nfdkjdksfjng.nsfd.gn .</w:t>
       </w:r>
       <w:proofErr w:type="spellStart"/>
@@ -3964,6 +4128,7 @@
         <w:t>lnkfglkfg</w:t>
       </w:r>
       <w:proofErr w:type="spellEnd"/>
+      <w:proofErr w:type="gramEnd"/>
       <w:r>
         <w:rPr>
           <w:rFonts w:ascii="Arial" w:hAnsi="Arial" w:cs="Arial"/>
@@ -4033,12 +4198,14 @@
         </w:rPr>
         <w:t>1.1.1</w:t>
       </w:r>
+      <w:proofErr w:type="gramStart"/>
       <w:r>
         <w:rPr>
           <w:rFonts w:ascii="Arial" w:hAnsi="Arial" w:cs="Arial"/>
         </w:rPr>
         <w:t xml:space="preserve">   (</w:t>
       </w:r>
+      <w:proofErr w:type="gramEnd"/>
       <w:r>
         <w:rPr>
           <w:rFonts w:ascii="Arial" w:hAnsi="Arial" w:cs="Arial"/>
@@ -4348,12 +4515,14 @@
         </w:rPr>
         <w:t>2.1.1</w:t>
       </w:r>
+      <w:proofErr w:type="gramStart"/>
       <w:r>
         <w:rPr>
           <w:rFonts w:ascii="Arial" w:hAnsi="Arial" w:cs="Arial"/>
         </w:rPr>
         <w:t xml:space="preserve">   (</w:t>
       </w:r>
+      <w:proofErr w:type="gramEnd"/>
       <w:r>
         <w:rPr>
           <w:rFonts w:ascii="Arial" w:hAnsi="Arial" w:cs="Arial"/>
@@ -4487,71 +4656,6 @@
     </w:p>
     <w:p>
       <w:pPr>
-        <w:jc w:val="center"/>
-        <w:rPr>
-          <w:rFonts w:ascii="Arial" w:hAnsi="Arial" w:cs="Arial"/>
-          <w:b/>
-        </w:rPr>
-      </w:pPr>
-    </w:p>
-    <w:p>
-      <w:pPr>
-        <w:rPr>
-          <w:rFonts w:ascii="Arial" w:hAnsi="Arial" w:cs="Arial"/>
-          <w:bCs/>
-        </w:rPr>
-      </w:pPr>
-    </w:p>
-    <w:p>
-      <w:pPr>
-        <w:pStyle w:val="Prrafodelista"/>
-        <w:numPr>
-          <w:ilvl w:val="1"/>
-          <w:numId w:val="2"/>
-        </w:numPr>
-        <w:spacing w:after="0" w:line="240" w:lineRule="auto"/>
-        <w:jc w:val="center"/>
-        <w:rPr>
-          <w:rFonts w:ascii="Arial" w:hAnsi="Arial" w:cs="Arial"/>
-          <w:b/>
-          <w:bCs/>
-          <w:sz w:val="24"/>
-          <w:szCs w:val="24"/>
-        </w:rPr>
-      </w:pPr>
-      <w:r>
-        <w:rPr>
-          <w:rFonts w:ascii="Arial" w:hAnsi="Arial" w:cs="Arial"/>
-          <w:b/>
-          <w:bCs/>
-          <w:sz w:val="24"/>
-          <w:szCs w:val="24"/>
-        </w:rPr>
-        <w:t xml:space="preserve">Planteamiento del </w:t>
-      </w:r>
-      <w:r>
-        <w:rPr>
-          <w:rFonts w:ascii="Arial" w:hAnsi="Arial" w:cs="Arial"/>
-          <w:b/>
-          <w:bCs/>
-          <w:sz w:val="24"/>
-          <w:szCs w:val="24"/>
-        </w:rPr>
-        <w:t>P</w:t>
-      </w:r>
-      <w:r>
-        <w:rPr>
-          <w:rFonts w:ascii="Arial" w:hAnsi="Arial" w:cs="Arial"/>
-          <w:b/>
-          <w:bCs/>
-          <w:sz w:val="24"/>
-          <w:szCs w:val="24"/>
-        </w:rPr>
-        <w:t>roblema</w:t>
-      </w:r>
-    </w:p>
-    <w:p>
-      <w:pPr>
         <w:rPr>
           <w:rFonts w:ascii="Arial" w:hAnsi="Arial" w:cs="Arial"/>
           <w:b/>
@@ -4577,125 +4681,299 @@
         <w:rPr>
           <w:rFonts w:ascii="Arial" w:hAnsi="Arial" w:cs="Arial"/>
         </w:rPr>
-        <w:t>La prevención del lavado de dinero constituye una obligación normativa central para las instituciones financieras a nivel global. De acuerdo con los estándares establecidos por el Grupo de Acción Financiera Internacional (GAFI) las Entidades deben contar con sistemas de monitoreo transaccional capaces de identificar, analizar y reportar oportunamente operaciones que presenten indicios de lavado de dinero o financiamiento al terrorismo (Grupo de Acción Financiera Internacional [GAFI], 2018)</w:t>
-      </w:r>
-      <w:r>
-        <w:rPr>
-          <w:rFonts w:ascii="Arial" w:hAnsi="Arial" w:cs="Arial"/>
-        </w:rPr>
-        <w:t>. En México, este deber se encuentra formalizado en la Ley Federal para la Prevención e Identificación de Operaciones con recursos de Procedencia Ilícita, y su cumplimiento es supervisado por la Comisión Nacional Bancaria y de Valores.</w:t>
-      </w:r>
-    </w:p>
-    <w:p>
-      <w:pPr>
-        <w:spacing w:line="360" w:lineRule="auto"/>
-        <w:rPr>
-          <w:rFonts w:ascii="Arial" w:hAnsi="Arial" w:cs="Arial"/>
-        </w:rPr>
-      </w:pPr>
-    </w:p>
-    <w:p>
-      <w:pPr>
-        <w:spacing w:line="360" w:lineRule="auto"/>
-        <w:ind w:firstLine="708"/>
-        <w:jc w:val="both"/>
-        <w:rPr>
-          <w:rFonts w:ascii="Arial" w:hAnsi="Arial" w:cs="Arial"/>
-        </w:rPr>
-      </w:pPr>
-      <w:r>
-        <w:rPr>
-          <w:rFonts w:ascii="Arial" w:hAnsi="Arial" w:cs="Arial"/>
-        </w:rPr>
-        <w:t xml:space="preserve">Sin embargo, la evidencia disponible muestra que esta expectativa no siempre se cumple en la práctica. </w:t>
-      </w:r>
-      <w:r>
-        <w:rPr>
-          <w:rFonts w:ascii="Arial" w:hAnsi="Arial" w:cs="Arial"/>
-        </w:rPr>
-        <w:t xml:space="preserve">La evaluación mutua realizada por GAFI a México (2018) documentó deficiencias relevantes en la efectividad del régimen nacional de prevención de lavado de dinero, particularmente en la calidad y oportunidad del análisis de las alertas generadas por los sujetos obligados. </w:t>
-      </w:r>
-    </w:p>
-    <w:p>
-      <w:pPr>
-        <w:ind w:firstLine="708"/>
-        <w:jc w:val="both"/>
-        <w:rPr>
-          <w:rFonts w:ascii="Arial" w:hAnsi="Arial" w:cs="Arial"/>
-        </w:rPr>
-      </w:pPr>
-    </w:p>
-    <w:p>
-      <w:pPr>
-        <w:spacing w:line="360" w:lineRule="auto"/>
-        <w:ind w:firstLine="708"/>
-        <w:jc w:val="both"/>
-        <w:rPr>
-          <w:rFonts w:ascii="Arial" w:hAnsi="Arial" w:cs="Arial"/>
-        </w:rPr>
-      </w:pPr>
-      <w:r>
-        <w:rPr>
-          <w:rFonts w:ascii="Arial" w:hAnsi="Arial" w:cs="Arial"/>
-        </w:rPr>
-        <w:t xml:space="preserve">La Oficina de las Naciones Unidas contra la Droga y el Delito estima que entre el 2% y el 5% del producto interno bruto mundial corresponde a operaciones de lavado de dinero (Oficina de las Naciones Unidas contra la Droga y el Delito [UNODC], s.f.), lo que muestra que </w:t>
-      </w:r>
-      <w:r>
-        <w:rPr>
-          <w:rFonts w:ascii="Arial" w:hAnsi="Arial" w:cs="Arial"/>
-        </w:rPr>
-        <w:t xml:space="preserve">el mecanismo para la </w:t>
-      </w:r>
-      <w:r>
-        <w:rPr>
-          <w:rFonts w:ascii="Arial" w:hAnsi="Arial" w:cs="Arial"/>
-        </w:rPr>
-        <w:lastRenderedPageBreak/>
-        <w:t>detección de operaciones sospechosas se deteriora</w:t>
-      </w:r>
-      <w:r>
-        <w:rPr>
-          <w:rFonts w:ascii="Arial" w:hAnsi="Arial" w:cs="Arial"/>
-        </w:rPr>
-        <w:t xml:space="preserve"> con el tiempo </w:t>
-      </w:r>
-      <w:r>
-        <w:rPr>
-          <w:rFonts w:ascii="Arial" w:hAnsi="Arial" w:cs="Arial"/>
-        </w:rPr>
-        <w:t xml:space="preserve">debido a la relación estadística entre las variables de entrada y el comportamiento que se busca predecir, mejor conocido como </w:t>
+        <w:t xml:space="preserve">De acuerdo con </w:t>
+      </w:r>
+      <w:r>
+        <w:rPr>
+          <w:rFonts w:ascii="Arial" w:hAnsi="Arial" w:cs="Arial"/>
+        </w:rPr>
+        <w:t>Albanese</w:t>
+      </w:r>
+      <w:r>
+        <w:rPr>
+          <w:rFonts w:ascii="Arial" w:hAnsi="Arial" w:cs="Arial"/>
+        </w:rPr>
+        <w:t xml:space="preserve"> (</w:t>
+      </w:r>
+      <w:r>
+        <w:rPr>
+          <w:rFonts w:ascii="Arial" w:hAnsi="Arial" w:cs="Arial"/>
+        </w:rPr>
+        <w:t>2012</w:t>
+      </w:r>
+      <w:r>
+        <w:rPr>
+          <w:rFonts w:ascii="Arial" w:hAnsi="Arial" w:cs="Arial"/>
+        </w:rPr>
+        <w:t xml:space="preserve">) todas las </w:t>
+      </w:r>
+      <w:r>
+        <w:rPr>
+          <w:rFonts w:ascii="Arial" w:hAnsi="Arial" w:cs="Arial"/>
+        </w:rPr>
+        <w:t>e</w:t>
+      </w:r>
+      <w:r>
+        <w:rPr>
+          <w:rFonts w:ascii="Arial" w:hAnsi="Arial" w:cs="Arial"/>
+        </w:rPr>
+        <w:t>ntidades que preten</w:t>
+      </w:r>
+      <w:r>
+        <w:rPr>
+          <w:rFonts w:ascii="Arial" w:hAnsi="Arial" w:cs="Arial"/>
+        </w:rPr>
+        <w:t>den</w:t>
+      </w:r>
+      <w:r>
+        <w:rPr>
+          <w:rFonts w:ascii="Arial" w:hAnsi="Arial" w:cs="Arial"/>
+        </w:rPr>
+        <w:t xml:space="preserve"> perdurar en el tiempo se enfrentan a cambios</w:t>
+      </w:r>
+      <w:r>
+        <w:rPr>
+          <w:rFonts w:ascii="Arial" w:hAnsi="Arial" w:cs="Arial"/>
+        </w:rPr>
+        <w:t xml:space="preserve"> radicales en</w:t>
+      </w:r>
+      <w:r>
+        <w:rPr>
+          <w:rFonts w:ascii="Arial" w:hAnsi="Arial" w:cs="Arial"/>
+        </w:rPr>
+        <w:t xml:space="preserve"> las</w:t>
+      </w:r>
+      <w:r>
+        <w:rPr>
+          <w:rFonts w:ascii="Arial" w:hAnsi="Arial" w:cs="Arial"/>
+        </w:rPr>
+        <w:t xml:space="preserve"> demandas políticas,</w:t>
+      </w:r>
+      <w:r>
+        <w:rPr>
+          <w:rFonts w:ascii="Arial" w:hAnsi="Arial" w:cs="Arial"/>
+        </w:rPr>
+        <w:t xml:space="preserve"> sociales, tecnológic</w:t>
+      </w:r>
+      <w:r>
+        <w:rPr>
+          <w:rFonts w:ascii="Arial" w:hAnsi="Arial" w:cs="Arial"/>
+        </w:rPr>
+        <w:t>a</w:t>
+      </w:r>
+      <w:r>
+        <w:rPr>
+          <w:rFonts w:ascii="Arial" w:hAnsi="Arial" w:cs="Arial"/>
+        </w:rPr>
+        <w:t>s</w:t>
+      </w:r>
+      <w:r>
+        <w:rPr>
+          <w:rFonts w:ascii="Arial" w:hAnsi="Arial" w:cs="Arial"/>
+        </w:rPr>
+        <w:t xml:space="preserve"> </w:t>
+      </w:r>
+      <w:r>
+        <w:rPr>
+          <w:rFonts w:ascii="Arial" w:hAnsi="Arial" w:cs="Arial"/>
+        </w:rPr>
+        <w:t>y, sobre</w:t>
+      </w:r>
+      <w:r>
+        <w:rPr>
+          <w:rFonts w:ascii="Arial" w:hAnsi="Arial" w:cs="Arial"/>
+        </w:rPr>
+        <w:t xml:space="preserve"> todo</w:t>
+      </w:r>
+      <w:r>
+        <w:rPr>
+          <w:rFonts w:ascii="Arial" w:hAnsi="Arial" w:cs="Arial"/>
+        </w:rPr>
+        <w:t>,</w:t>
+      </w:r>
+      <w:r>
+        <w:rPr>
+          <w:rFonts w:ascii="Arial" w:hAnsi="Arial" w:cs="Arial"/>
+        </w:rPr>
+        <w:t xml:space="preserve"> al surgimiento de</w:t>
+      </w:r>
+      <w:r>
+        <w:rPr>
+          <w:rFonts w:ascii="Arial" w:hAnsi="Arial" w:cs="Arial"/>
+        </w:rPr>
+        <w:t xml:space="preserve"> técnicas sofisticadas</w:t>
+      </w:r>
+      <w:r>
+        <w:rPr>
+          <w:rFonts w:ascii="Arial" w:hAnsi="Arial" w:cs="Arial"/>
+        </w:rPr>
+        <w:t xml:space="preserve"> </w:t>
+      </w:r>
+      <w:r>
+        <w:rPr>
+          <w:rFonts w:ascii="Arial" w:hAnsi="Arial" w:cs="Arial"/>
+        </w:rPr>
+        <w:t>de</w:t>
+      </w:r>
+      <w:r>
+        <w:rPr>
+          <w:rFonts w:ascii="Arial" w:hAnsi="Arial" w:cs="Arial"/>
+        </w:rPr>
+        <w:t xml:space="preserve"> </w:t>
+      </w:r>
+      <w:r>
+        <w:rPr>
+          <w:rFonts w:ascii="Arial" w:hAnsi="Arial" w:cs="Arial"/>
+        </w:rPr>
+        <w:t>fraude</w:t>
+      </w:r>
+      <w:r>
+        <w:rPr>
+          <w:rFonts w:ascii="Arial" w:hAnsi="Arial" w:cs="Arial"/>
+        </w:rPr>
+        <w:t xml:space="preserve">. </w:t>
+      </w:r>
+      <w:r>
+        <w:rPr>
+          <w:rFonts w:ascii="Arial" w:hAnsi="Arial" w:cs="Arial"/>
+        </w:rPr>
+        <w:t>Entre los riesgos que estas técnicas plantean destaca el lavado de dinero</w:t>
+      </w:r>
+      <w:r>
+        <w:rPr>
+          <w:rFonts w:ascii="Arial" w:hAnsi="Arial" w:cs="Arial"/>
+        </w:rPr>
+        <w:t xml:space="preserve">, </w:t>
+      </w:r>
+      <w:r>
+        <w:rPr>
+          <w:rFonts w:ascii="Arial" w:hAnsi="Arial" w:cs="Arial"/>
+        </w:rPr>
+        <w:t xml:space="preserve">entendido </w:t>
+      </w:r>
+      <w:r>
+        <w:rPr>
+          <w:rFonts w:ascii="Arial" w:hAnsi="Arial" w:cs="Arial"/>
+        </w:rPr>
+        <w:t>como el</w:t>
+      </w:r>
+      <w:r>
+        <w:rPr>
+          <w:rFonts w:ascii="Arial" w:hAnsi="Arial" w:cs="Arial"/>
+        </w:rPr>
+        <w:t xml:space="preserve"> proceso en virtud del cual los bienes de origen delictivo se integran en el sistema económico legal </w:t>
+      </w:r>
+      <w:r>
+        <w:rPr>
+          <w:rFonts w:ascii="Arial" w:hAnsi="Arial" w:cs="Arial"/>
+        </w:rPr>
+        <w:t>aparentando</w:t>
+      </w:r>
+      <w:r>
+        <w:rPr>
+          <w:rFonts w:ascii="Arial" w:hAnsi="Arial" w:cs="Arial"/>
+        </w:rPr>
+        <w:t xml:space="preserve"> haber sido obtenidos de forma l</w:t>
+      </w:r>
+      <w:r>
+        <w:rPr>
+          <w:rFonts w:ascii="Arial" w:hAnsi="Arial" w:cs="Arial"/>
+        </w:rPr>
+        <w:t>í</w:t>
+      </w:r>
+      <w:r>
+        <w:rPr>
+          <w:rFonts w:ascii="Arial" w:hAnsi="Arial" w:cs="Arial"/>
+        </w:rPr>
+        <w:t>cita</w:t>
+      </w:r>
+      <w:r>
+        <w:rPr>
+          <w:rFonts w:ascii="Arial" w:hAnsi="Arial" w:cs="Arial"/>
+        </w:rPr>
+        <w:t xml:space="preserve"> </w:t>
+      </w:r>
+      <w:r>
+        <w:rPr>
+          <w:rFonts w:ascii="Arial" w:hAnsi="Arial" w:cs="Arial"/>
+        </w:rPr>
+        <w:t>(Blanco Cordero, 1997, p. 101)</w:t>
+      </w:r>
+      <w:r>
+        <w:rPr>
+          <w:rFonts w:ascii="Arial" w:hAnsi="Arial" w:cs="Arial"/>
+        </w:rPr>
+        <w:t>.</w:t>
+      </w:r>
+      <w:r>
+        <w:rPr>
+          <w:rFonts w:ascii="Arial" w:hAnsi="Arial" w:cs="Arial"/>
+        </w:rPr>
+        <w:t xml:space="preserve"> </w:t>
+      </w:r>
+      <w:r>
+        <w:rPr>
+          <w:rFonts w:ascii="Arial" w:hAnsi="Arial" w:cs="Arial"/>
+        </w:rPr>
+        <w:t>Su detección comenzó en la década de 1970, cuando las instituciones financieras empezaron a reportar transacciones al gobierno, pero quienes lavan dinero han mostrado adaptabilidad para encontrar nuevos canales, como los sitios web comerciales y los sistemas de pago por internet (Rocha-Salazar et ál., 2021).</w:t>
+      </w:r>
+      <w:r>
+        <w:rPr>
+          <w:rFonts w:ascii="Arial" w:hAnsi="Arial" w:cs="Arial"/>
+        </w:rPr>
+        <w:t xml:space="preserve"> </w:t>
+      </w:r>
+      <w:r>
+        <w:rPr>
+          <w:rFonts w:ascii="Arial" w:hAnsi="Arial" w:cs="Arial"/>
+        </w:rPr>
+        <w:t xml:space="preserve">Se estima que cada año se lava entre 2% y 5% del producto interno bruto mundial, es decir, entre 800 mil millones y 2 billones de dólares </w:t>
+      </w:r>
+      <w:r>
+        <w:rPr>
+          <w:rFonts w:ascii="Arial" w:hAnsi="Arial" w:cs="Arial"/>
+        </w:rPr>
+        <w:t>(</w:t>
       </w:r>
       <w:proofErr w:type="spellStart"/>
       <w:r>
         <w:rPr>
           <w:rFonts w:ascii="Arial" w:hAnsi="Arial" w:cs="Arial"/>
-          <w:i/>
-          <w:iCs/>
-        </w:rPr>
-        <w:t>drift</w:t>
+        </w:rPr>
+        <w:t>United</w:t>
       </w:r>
       <w:proofErr w:type="spellEnd"/>
       <w:r>
         <w:rPr>
           <w:rFonts w:ascii="Arial" w:hAnsi="Arial" w:cs="Arial"/>
         </w:rPr>
-        <w:t xml:space="preserve"> (Estrada López, 2026). Cuando el </w:t>
+        <w:t xml:space="preserve"> Nations Office </w:t>
       </w:r>
       <w:proofErr w:type="spellStart"/>
       <w:r>
         <w:rPr>
           <w:rFonts w:ascii="Arial" w:hAnsi="Arial" w:cs="Arial"/>
-          <w:i/>
-          <w:iCs/>
-        </w:rPr>
-        <w:t>drift</w:t>
+        </w:rPr>
+        <w:t>on</w:t>
       </w:r>
       <w:proofErr w:type="spellEnd"/>
       <w:r>
         <w:rPr>
           <w:rFonts w:ascii="Arial" w:hAnsi="Arial" w:cs="Arial"/>
-          <w:i/>
-          <w:iCs/>
+        </w:rPr>
+        <w:t xml:space="preserve"> Drugs and </w:t>
+      </w:r>
+      <w:proofErr w:type="spellStart"/>
+      <w:r>
+        <w:rPr>
+          <w:rFonts w:ascii="Arial" w:hAnsi="Arial" w:cs="Arial"/>
+        </w:rPr>
+        <w:t>Crime</w:t>
+      </w:r>
+      <w:proofErr w:type="spellEnd"/>
+      <w:r>
+        <w:rPr>
+          <w:rFonts w:ascii="Arial" w:hAnsi="Arial" w:cs="Arial"/>
         </w:rPr>
         <w:t xml:space="preserve"> </w:t>
       </w:r>
@@ -4703,214 +4981,44 @@
         <w:rPr>
           <w:rFonts w:ascii="Arial" w:hAnsi="Arial" w:cs="Arial"/>
         </w:rPr>
-        <w:t>no es monitoreado oportunamente</w:t>
-      </w:r>
-      <w:r>
-        <w:rPr>
-          <w:rFonts w:ascii="Arial" w:hAnsi="Arial" w:cs="Arial"/>
-        </w:rPr>
-        <w:t>,</w:t>
-      </w:r>
-      <w:r>
-        <w:rPr>
-          <w:rFonts w:ascii="Arial" w:hAnsi="Arial" w:cs="Arial"/>
-        </w:rPr>
-        <w:t xml:space="preserve"> sus fluctuaciones degradan al modelo</w:t>
-      </w:r>
-      <w:r>
-        <w:rPr>
-          <w:rFonts w:ascii="Arial" w:hAnsi="Arial" w:cs="Arial"/>
-        </w:rPr>
-        <w:t>,</w:t>
-      </w:r>
-      <w:r>
-        <w:rPr>
-          <w:rFonts w:ascii="Arial" w:hAnsi="Arial" w:cs="Arial"/>
-        </w:rPr>
-        <w:t xml:space="preserve"> incrementando el riesgo de omitir operaciones ilícitas</w:t>
-      </w:r>
-      <w:r>
-        <w:rPr>
-          <w:rFonts w:ascii="Arial" w:hAnsi="Arial" w:cs="Arial"/>
-        </w:rPr>
-        <w:t>,</w:t>
-      </w:r>
-      <w:r>
-        <w:rPr>
-          <w:rFonts w:ascii="Arial" w:hAnsi="Arial" w:cs="Arial"/>
-        </w:rPr>
-        <w:t xml:space="preserve"> así como la generación de alertas irrelevantes que saturan a los equipos de cumplimiento.</w:t>
-      </w:r>
-    </w:p>
-    <w:p>
-      <w:pPr>
-        <w:ind w:firstLine="708"/>
-        <w:jc w:val="both"/>
-        <w:rPr>
-          <w:rFonts w:ascii="Arial" w:hAnsi="Arial" w:cs="Arial"/>
-        </w:rPr>
-      </w:pPr>
-    </w:p>
-    <w:p>
-      <w:pPr>
-        <w:spacing w:line="360" w:lineRule="auto"/>
-        <w:ind w:firstLine="708"/>
-        <w:jc w:val="both"/>
-        <w:rPr>
-          <w:rFonts w:ascii="Arial" w:hAnsi="Arial" w:cs="Arial"/>
-        </w:rPr>
-      </w:pPr>
-      <w:r>
-        <w:rPr>
-          <w:rFonts w:ascii="Arial" w:hAnsi="Arial" w:cs="Arial"/>
-        </w:rPr>
-        <w:t xml:space="preserve">De acuerdo con ACI </w:t>
-      </w:r>
-      <w:proofErr w:type="spellStart"/>
-      <w:r>
-        <w:rPr>
-          <w:rFonts w:ascii="Arial" w:hAnsi="Arial" w:cs="Arial"/>
-        </w:rPr>
-        <w:t>Worldwide</w:t>
-      </w:r>
-      <w:proofErr w:type="spellEnd"/>
-      <w:r>
-        <w:rPr>
-          <w:rFonts w:ascii="Arial" w:hAnsi="Arial" w:cs="Arial"/>
-        </w:rPr>
-        <w:t xml:space="preserve"> </w:t>
-      </w:r>
-      <w:r>
-        <w:rPr>
-          <w:rFonts w:ascii="Arial" w:hAnsi="Arial" w:cs="Arial"/>
-        </w:rPr>
-        <w:t>(2026) las p</w:t>
-      </w:r>
-      <w:r>
-        <w:rPr>
-          <w:rFonts w:ascii="Arial" w:hAnsi="Arial" w:cs="Arial"/>
-        </w:rPr>
-        <w:t>é</w:t>
-      </w:r>
-      <w:r>
-        <w:rPr>
-          <w:rFonts w:ascii="Arial" w:hAnsi="Arial" w:cs="Arial"/>
-        </w:rPr>
-        <w:t xml:space="preserve">rdidas por fraude a nivel global crecen a un ritmo aproximado del 20% anual, y advierte que la inteligencia artificial basada en agentes está siendo utilizada activamente por actores maliciosos para automatizar operaciones fraudulentas a una velocidad que las arquitecturas de monitoreo tradicionales no logran igualar. Del mismo modo, McKinsey &amp; Company </w:t>
-      </w:r>
-      <w:r>
-        <w:rPr>
-          <w:rFonts w:ascii="Arial" w:hAnsi="Arial" w:cs="Arial"/>
-        </w:rPr>
-        <w:t>(</w:t>
-      </w:r>
-      <w:r>
-        <w:rPr>
-          <w:rFonts w:ascii="Arial" w:hAnsi="Arial" w:cs="Arial"/>
-          <w:highlight w:val="yellow"/>
-        </w:rPr>
-        <w:t>año)</w:t>
-      </w:r>
-      <w:r>
-        <w:rPr>
-          <w:rFonts w:ascii="Arial" w:hAnsi="Arial" w:cs="Arial"/>
-        </w:rPr>
-        <w:t xml:space="preserve"> </w:t>
-      </w:r>
-      <w:r>
-        <w:rPr>
-          <w:rFonts w:ascii="Arial" w:hAnsi="Arial" w:cs="Arial"/>
-        </w:rPr>
-        <w:t>ha</w:t>
-      </w:r>
-      <w:r>
-        <w:rPr>
-          <w:rFonts w:ascii="Arial" w:hAnsi="Arial" w:cs="Arial"/>
-        </w:rPr>
-        <w:t>n</w:t>
-      </w:r>
-      <w:r>
-        <w:rPr>
-          <w:rFonts w:ascii="Arial" w:hAnsi="Arial" w:cs="Arial"/>
-        </w:rPr>
-        <w:t xml:space="preserve"> documentado que la aplicación de inteligencia artificial basada en agentes para fortalecer los procesos de prevención de lavado de </w:t>
-      </w:r>
-      <w:r>
-        <w:rPr>
-          <w:rFonts w:ascii="Arial" w:hAnsi="Arial" w:cs="Arial"/>
-        </w:rPr>
-        <w:t>dinero</w:t>
-      </w:r>
-      <w:r>
-        <w:rPr>
-          <w:rFonts w:ascii="Arial" w:hAnsi="Arial" w:cs="Arial"/>
-        </w:rPr>
-        <w:t xml:space="preserve"> ha representado una de las líneas de desarrollo </w:t>
-      </w:r>
-      <w:r>
-        <w:rPr>
-          <w:rFonts w:ascii="Arial" w:hAnsi="Arial" w:cs="Arial"/>
-        </w:rPr>
-        <w:t>más</w:t>
-      </w:r>
-      <w:r>
-        <w:rPr>
-          <w:rFonts w:ascii="Arial" w:hAnsi="Arial" w:cs="Arial"/>
-        </w:rPr>
-        <w:t xml:space="preserve"> relevantes para la industria bancaria en la actualidad</w:t>
-      </w:r>
-      <w:r>
-        <w:rPr>
-          <w:rFonts w:ascii="Arial" w:hAnsi="Arial" w:cs="Arial"/>
-        </w:rPr>
-        <w:t xml:space="preserve">. </w:t>
-      </w:r>
-    </w:p>
-    <w:p>
-      <w:pPr>
-        <w:ind w:firstLine="708"/>
-        <w:jc w:val="both"/>
-        <w:rPr>
-          <w:rFonts w:ascii="Arial" w:hAnsi="Arial" w:cs="Arial"/>
-        </w:rPr>
-      </w:pPr>
-    </w:p>
-    <w:p>
-      <w:pPr>
-        <w:spacing w:line="360" w:lineRule="auto"/>
-        <w:ind w:firstLine="708"/>
-        <w:jc w:val="both"/>
-        <w:rPr>
-          <w:rFonts w:ascii="Arial" w:hAnsi="Arial" w:cs="Arial"/>
-        </w:rPr>
-      </w:pPr>
-      <w:r>
-        <w:rPr>
-          <w:rFonts w:ascii="Arial" w:hAnsi="Arial" w:cs="Arial"/>
-        </w:rPr>
-        <w:t xml:space="preserve">De lo anterior se desprende que en la </w:t>
-      </w:r>
-      <w:r>
-        <w:rPr>
-          <w:rFonts w:ascii="Arial" w:hAnsi="Arial" w:cs="Arial"/>
-        </w:rPr>
-        <w:t>práctica</w:t>
-      </w:r>
-      <w:r>
-        <w:rPr>
-          <w:rFonts w:ascii="Arial" w:hAnsi="Arial" w:cs="Arial"/>
-        </w:rPr>
-        <w:t xml:space="preserve"> actual los sistemas de detección de operaciones sospechosas presentan carencias en materia de gobernanza de su desempeño, así como una capacidad limitada para explicar y priorizar prolongados, saturación de los equipos de cumplimiento y un riesgo residual de detección tardía. Por lo tanto, este proyecto pretende contestar la siguiente pregunta de investigación: </w:t>
-      </w:r>
-    </w:p>
-    <w:p>
-      <w:pPr>
-        <w:ind w:firstLine="708"/>
-        <w:jc w:val="both"/>
-        <w:rPr>
-          <w:rFonts w:ascii="Arial" w:hAnsi="Arial" w:cs="Arial"/>
-        </w:rPr>
-      </w:pPr>
+        <w:t>[UNODC], s.f.)</w:t>
+      </w:r>
+      <w:r>
+        <w:rPr>
+          <w:rFonts w:ascii="Arial" w:hAnsi="Arial" w:cs="Arial"/>
+        </w:rPr>
+        <w:t>.</w:t>
+      </w:r>
+      <w:r>
+        <w:rPr>
+          <w:rFonts w:ascii="Arial" w:hAnsi="Arial" w:cs="Arial"/>
+        </w:rPr>
+        <w:t xml:space="preserve"> Este delito debilita la integridad del sistema financiero, provoca la pérdida de control de los países sobre sus políticas económicas, distorsiona la economía y reduce la recaudación fiscal </w:t>
+      </w:r>
+      <w:r>
+        <w:rPr>
+          <w:rFonts w:ascii="Arial" w:hAnsi="Arial" w:cs="Arial"/>
+        </w:rPr>
+        <w:t>(Rocha-Salazar et ál., 2021)</w:t>
+      </w:r>
+      <w:r>
+        <w:rPr>
+          <w:rFonts w:ascii="Arial" w:hAnsi="Arial" w:cs="Arial"/>
+        </w:rPr>
+        <w:t>.</w:t>
+      </w:r>
+      <w:r>
+        <w:rPr>
+          <w:rFonts w:ascii="Arial" w:hAnsi="Arial" w:cs="Arial"/>
+        </w:rPr>
+        <w:t xml:space="preserve"> I</w:t>
+      </w:r>
+      <w:r>
+        <w:rPr>
+          <w:rFonts w:ascii="Arial" w:hAnsi="Arial" w:cs="Arial"/>
+        </w:rPr>
+        <w:t>dentificar estas operaciones exige reconocer patrones que ya no responden a esquemas estáticos.</w:t>
+      </w:r>
     </w:p>
     <w:p>
       <w:pPr>
@@ -4920,55 +5028,177 @@
           <w:rFonts w:ascii="Arial" w:hAnsi="Arial" w:cs="Arial"/>
         </w:rPr>
       </w:pPr>
-      <w:r>
-        <w:rPr>
-          <w:rFonts w:ascii="Arial" w:hAnsi="Arial" w:cs="Arial"/>
-        </w:rPr>
-        <w:t>¿En qué medida</w:t>
-      </w:r>
-      <w:r>
-        <w:rPr>
-          <w:rFonts w:ascii="Arial" w:hAnsi="Arial" w:cs="Arial"/>
-        </w:rPr>
-        <w:t>,</w:t>
-      </w:r>
-      <w:r>
-        <w:rPr>
-          <w:rFonts w:ascii="Arial" w:hAnsi="Arial" w:cs="Arial"/>
-        </w:rPr>
-        <w:t xml:space="preserve"> un sistema </w:t>
+    </w:p>
+    <w:p>
+      <w:pPr>
+        <w:spacing w:line="360" w:lineRule="auto"/>
+        <w:jc w:val="both"/>
+        <w:rPr>
+          <w:rFonts w:ascii="Arial" w:hAnsi="Arial" w:cs="Arial"/>
+        </w:rPr>
+      </w:pPr>
+      <w:r>
+        <w:rPr>
+          <w:rFonts w:ascii="Arial" w:hAnsi="Arial" w:cs="Arial"/>
+        </w:rPr>
+        <w:t xml:space="preserve">          </w:t>
+      </w:r>
+      <w:r>
+        <w:rPr>
+          <w:rFonts w:ascii="Arial" w:hAnsi="Arial" w:cs="Arial"/>
+        </w:rPr>
+        <w:t xml:space="preserve">Ante este panorama, la respuesta internacional ha sido establecer estándares </w:t>
+      </w:r>
+      <w:r>
+        <w:rPr>
+          <w:rFonts w:ascii="Arial" w:hAnsi="Arial" w:cs="Arial"/>
+        </w:rPr>
+        <w:t>normativos</w:t>
+      </w:r>
+      <w:r>
+        <w:rPr>
+          <w:rFonts w:ascii="Arial" w:hAnsi="Arial" w:cs="Arial"/>
+        </w:rPr>
+        <w:t xml:space="preserve">. El Grupo de Acción Financiera Internacional (GAFI) es un organismo intergubernamental independiente que desarrolla y promueve políticas para proteger el sistema financiero global contra el lavado de dinero, el financiamiento del terrorismo y el financiamiento de la </w:t>
+      </w:r>
+      <w:r>
+        <w:rPr>
+          <w:rFonts w:ascii="Arial" w:hAnsi="Arial" w:cs="Arial"/>
+        </w:rPr>
+        <w:lastRenderedPageBreak/>
+        <w:t>proliferación de armas de destrucción masiva, y sus recomendaciones son reconocidas como el estándar global en la materia (</w:t>
       </w:r>
       <w:proofErr w:type="spellStart"/>
       <w:r>
         <w:rPr>
           <w:rFonts w:ascii="Arial" w:hAnsi="Arial" w:cs="Arial"/>
         </w:rPr>
-        <w:t>multiagente</w:t>
+        <w:t>Financial</w:t>
       </w:r>
       <w:proofErr w:type="spellEnd"/>
       <w:r>
         <w:rPr>
           <w:rFonts w:ascii="Arial" w:hAnsi="Arial" w:cs="Arial"/>
         </w:rPr>
-        <w:t>,</w:t>
-      </w:r>
-      <w:r>
-        <w:rPr>
-          <w:rFonts w:ascii="Arial" w:hAnsi="Arial" w:cs="Arial"/>
-        </w:rPr>
-        <w:t xml:space="preserve"> basado en modelos de lenguaje de gran escala, capaz de monitorear el desempeño de un modelo de detección de operaciones sospechosas, diagnosticar las causas de su deterioro y generar narrativas explicativas para su reporte, reduce el tiempo de detección y de respuesta ante un deterioro del modelo</w:t>
-      </w:r>
-      <w:r>
-        <w:rPr>
-          <w:rFonts w:ascii="Arial" w:hAnsi="Arial" w:cs="Arial"/>
-        </w:rPr>
-        <w:t>,</w:t>
-      </w:r>
-      <w:r>
-        <w:rPr>
-          <w:rFonts w:ascii="Arial" w:hAnsi="Arial" w:cs="Arial"/>
-        </w:rPr>
-        <w:t xml:space="preserve"> en comparación con un esquema de monitoreo tradicional?</w:t>
+        <w:t xml:space="preserve"> </w:t>
+      </w:r>
+      <w:proofErr w:type="spellStart"/>
+      <w:r>
+        <w:rPr>
+          <w:rFonts w:ascii="Arial" w:hAnsi="Arial" w:cs="Arial"/>
+        </w:rPr>
+        <w:t>Action</w:t>
+      </w:r>
+      <w:proofErr w:type="spellEnd"/>
+      <w:r>
+        <w:rPr>
+          <w:rFonts w:ascii="Arial" w:hAnsi="Arial" w:cs="Arial"/>
+        </w:rPr>
+        <w:t xml:space="preserve"> </w:t>
+      </w:r>
+      <w:proofErr w:type="spellStart"/>
+      <w:r>
+        <w:rPr>
+          <w:rFonts w:ascii="Arial" w:hAnsi="Arial" w:cs="Arial"/>
+        </w:rPr>
+        <w:t>Task</w:t>
+      </w:r>
+      <w:proofErr w:type="spellEnd"/>
+      <w:r>
+        <w:rPr>
+          <w:rFonts w:ascii="Arial" w:hAnsi="Arial" w:cs="Arial"/>
+        </w:rPr>
+        <w:t xml:space="preserve"> Force [FATF], 202</w:t>
+      </w:r>
+      <w:r>
+        <w:rPr>
+          <w:rFonts w:ascii="Arial" w:hAnsi="Arial" w:cs="Arial"/>
+        </w:rPr>
+        <w:t>2</w:t>
+      </w:r>
+      <w:r>
+        <w:rPr>
+          <w:rFonts w:ascii="Arial" w:hAnsi="Arial" w:cs="Arial"/>
+        </w:rPr>
+        <w:t xml:space="preserve">). </w:t>
+      </w:r>
+      <w:r>
+        <w:rPr>
+          <w:rFonts w:ascii="Arial" w:hAnsi="Arial" w:cs="Arial"/>
+        </w:rPr>
+        <w:t>Los avances normativos son notables: el cumplimiento técnico de las jurisdicciones evaluadas pasó de 36% en 20</w:t>
+      </w:r>
+      <w:r>
+        <w:rPr>
+          <w:rFonts w:ascii="Arial" w:hAnsi="Arial" w:cs="Arial"/>
+        </w:rPr>
+        <w:t>12</w:t>
+      </w:r>
+      <w:r>
+        <w:rPr>
+          <w:rFonts w:ascii="Arial" w:hAnsi="Arial" w:cs="Arial"/>
+        </w:rPr>
+        <w:t xml:space="preserve"> a 76% (FATF,</w:t>
+      </w:r>
+      <w:r>
+        <w:rPr>
+          <w:rFonts w:ascii="Arial" w:hAnsi="Arial" w:cs="Arial"/>
+        </w:rPr>
+        <w:t xml:space="preserve"> </w:t>
+      </w:r>
+      <w:r>
+        <w:rPr>
+          <w:rFonts w:ascii="Arial" w:hAnsi="Arial" w:cs="Arial"/>
+        </w:rPr>
+        <w:t>2022, p.5). Sin embargo, solo el 21% alcanza un nivel promedio de efectividad alto o sustancial (FATF,</w:t>
+      </w:r>
+      <w:r>
+        <w:rPr>
+          <w:rFonts w:ascii="Arial" w:hAnsi="Arial" w:cs="Arial"/>
+        </w:rPr>
+        <w:t xml:space="preserve"> </w:t>
+      </w:r>
+      <w:r>
+        <w:rPr>
+          <w:rFonts w:ascii="Arial" w:hAnsi="Arial" w:cs="Arial"/>
+        </w:rPr>
+        <w:t xml:space="preserve">2022, p.11). </w:t>
+      </w:r>
+      <w:r>
+        <w:rPr>
+          <w:rFonts w:ascii="Arial" w:hAnsi="Arial" w:cs="Arial"/>
+        </w:rPr>
+        <w:t>Por lo tanto, t</w:t>
+      </w:r>
+      <w:r>
+        <w:rPr>
+          <w:rFonts w:ascii="Arial" w:hAnsi="Arial" w:cs="Arial"/>
+        </w:rPr>
+        <w:t xml:space="preserve">ener normas no garantiza que funcionen, y ello vuelve decisivo el instrumento con el que las instituciones identifican las operaciones sospechosas. Durante décadas ese instrumento fueron reglas fijas con umbrales predefinidos, pero la disponibilidad </w:t>
+      </w:r>
+      <w:r>
+        <w:rPr>
+          <w:rFonts w:ascii="Arial" w:hAnsi="Arial" w:cs="Arial"/>
+        </w:rPr>
+        <w:t>de</w:t>
+      </w:r>
+      <w:r>
+        <w:rPr>
+          <w:rFonts w:ascii="Arial" w:hAnsi="Arial" w:cs="Arial"/>
+        </w:rPr>
+        <w:t xml:space="preserve"> grandes bases de datos, el mayor poder de cómputo y el desarrollo de paquetes de software llevaron a incorporar técnicas de inteligencia artificial para superar </w:t>
+      </w:r>
+      <w:r>
+        <w:rPr>
+          <w:rFonts w:ascii="Arial" w:hAnsi="Arial" w:cs="Arial"/>
+        </w:rPr>
+        <w:t>las deficiencias</w:t>
+      </w:r>
+      <w:r>
+        <w:rPr>
+          <w:rFonts w:ascii="Arial" w:hAnsi="Arial" w:cs="Arial"/>
+        </w:rPr>
+        <w:t xml:space="preserve"> de los métodos tradicionales (Rocha-Salazar et ál., 2021). </w:t>
       </w:r>
     </w:p>
     <w:bookmarkEnd w:id="1"/>
@@ -5270,12 +5500,14 @@
         </w:rPr>
         <w:t>1.1.1</w:t>
       </w:r>
+      <w:proofErr w:type="gramStart"/>
       <w:r>
         <w:rPr>
           <w:rFonts w:ascii="Arial" w:hAnsi="Arial" w:cs="Arial"/>
         </w:rPr>
         <w:t xml:space="preserve">   (</w:t>
       </w:r>
+      <w:proofErr w:type="gramEnd"/>
       <w:r>
         <w:rPr>
           <w:rFonts w:ascii="Arial" w:hAnsi="Arial" w:cs="Arial"/>
@@ -5366,12 +5598,14 @@
         </w:rPr>
         <w:t>1.1.1.1</w:t>
       </w:r>
+      <w:proofErr w:type="gramStart"/>
       <w:r>
         <w:rPr>
           <w:rFonts w:ascii="Arial" w:hAnsi="Arial" w:cs="Arial"/>
         </w:rPr>
         <w:t xml:space="preserve">   (</w:t>
       </w:r>
+      <w:proofErr w:type="gramEnd"/>
       <w:r>
         <w:rPr>
           <w:rFonts w:ascii="Arial" w:hAnsi="Arial" w:cs="Arial"/>
@@ -6087,12 +6321,14 @@
         </w:rPr>
         <w:t>1.1.1</w:t>
       </w:r>
+      <w:proofErr w:type="gramStart"/>
       <w:r>
         <w:rPr>
           <w:rFonts w:ascii="Arial" w:hAnsi="Arial" w:cs="Arial"/>
         </w:rPr>
         <w:t xml:space="preserve">   (</w:t>
       </w:r>
+      <w:proofErr w:type="gramEnd"/>
       <w:r>
         <w:rPr>
           <w:rFonts w:ascii="Arial" w:hAnsi="Arial" w:cs="Arial"/>
@@ -6508,12 +6744,14 @@
         </w:rPr>
         <w:t>1.1.1</w:t>
       </w:r>
+      <w:proofErr w:type="gramStart"/>
       <w:r>
         <w:rPr>
           <w:rFonts w:ascii="Arial" w:hAnsi="Arial" w:cs="Arial"/>
         </w:rPr>
         <w:t xml:space="preserve">   (</w:t>
       </w:r>
+      <w:proofErr w:type="gramEnd"/>
       <w:r>
         <w:rPr>
           <w:rFonts w:ascii="Arial" w:hAnsi="Arial" w:cs="Arial"/>
@@ -6907,12 +7145,14 @@
         </w:rPr>
         <w:t>1.1.1</w:t>
       </w:r>
+      <w:proofErr w:type="gramStart"/>
       <w:r>
         <w:rPr>
           <w:rFonts w:ascii="Arial" w:hAnsi="Arial" w:cs="Arial"/>
         </w:rPr>
         <w:t xml:space="preserve">   (</w:t>
       </w:r>
+      <w:proofErr w:type="gramEnd"/>
       <w:r>
         <w:rPr>
           <w:rFonts w:ascii="Arial" w:hAnsi="Arial" w:cs="Arial"/>
@@ -7075,15 +7315,13 @@
           <w:rFonts w:ascii="Arial" w:hAnsi="Arial" w:cs="Arial"/>
           <w:b/>
           <w:bCs/>
-          <w:lang w:val="en-US"/>
-        </w:rPr>
-      </w:pPr>
-      <w:r>
-        <w:rPr>
-          <w:rFonts w:ascii="Arial" w:hAnsi="Arial" w:cs="Arial"/>
-          <w:b/>
-          <w:bCs/>
-          <w:lang w:val="en-US"/>
+        </w:rPr>
+      </w:pPr>
+      <w:r>
+        <w:rPr>
+          <w:rFonts w:ascii="Arial" w:hAnsi="Arial" w:cs="Arial"/>
+          <w:b/>
+          <w:bCs/>
         </w:rPr>
         <w:t>APÉNDICES</w:t>
       </w:r>
@@ -7095,29 +7333,25 @@
           <w:rFonts w:ascii="Arial" w:hAnsi="Arial" w:cs="Arial"/>
           <w:b/>
           <w:bCs/>
-          <w:lang w:val="en-US"/>
-        </w:rPr>
-      </w:pPr>
-    </w:p>
-    <w:p>
-      <w:pPr>
-        <w:rPr>
-          <w:rFonts w:ascii="Arial" w:hAnsi="Arial" w:cs="Arial"/>
-          <w:lang w:val="en-US"/>
-        </w:rPr>
-      </w:pPr>
-    </w:p>
-    <w:p>
-      <w:pPr>
-        <w:rPr>
-          <w:rFonts w:ascii="Arial" w:hAnsi="Arial" w:cs="Arial"/>
-          <w:lang w:val="en-US"/>
-        </w:rPr>
-      </w:pPr>
-      <w:r>
-        <w:rPr>
-          <w:rFonts w:ascii="Arial" w:hAnsi="Arial" w:cs="Arial"/>
-          <w:lang w:val="en-US"/>
+        </w:rPr>
+      </w:pPr>
+    </w:p>
+    <w:p>
+      <w:pPr>
+        <w:rPr>
+          <w:rFonts w:ascii="Arial" w:hAnsi="Arial" w:cs="Arial"/>
+        </w:rPr>
+      </w:pPr>
+    </w:p>
+    <w:p>
+      <w:pPr>
+        <w:rPr>
+          <w:rFonts w:ascii="Arial" w:hAnsi="Arial" w:cs="Arial"/>
+        </w:rPr>
+      </w:pPr>
+      <w:r>
+        <w:rPr>
+          <w:rFonts w:ascii="Arial" w:hAnsi="Arial" w:cs="Arial"/>
         </w:rPr>
         <w:br w:type="page"/>
       </w:r>
@@ -7128,7 +7362,6 @@
         <w:jc w:val="both"/>
         <w:rPr>
           <w:rFonts w:ascii="Arial" w:hAnsi="Arial" w:cs="Arial"/>
-          <w:lang w:val="en-US"/>
         </w:rPr>
       </w:pPr>
     </w:p>
@@ -7138,7 +7371,6 @@
         <w:spacing w:line="480" w:lineRule="auto"/>
         <w:rPr>
           <w:rFonts w:ascii="Arial" w:hAnsi="Arial" w:cs="Arial"/>
-          <w:lang w:val="en-US"/>
         </w:rPr>
       </w:pPr>
     </w:p>
@@ -7147,7 +7379,6 @@
         <w:spacing w:line="480" w:lineRule="auto"/>
         <w:rPr>
           <w:rFonts w:ascii="Arial" w:hAnsi="Arial" w:cs="Arial"/>
-          <w:lang w:val="en-US"/>
         </w:rPr>
       </w:pPr>
     </w:p>
@@ -7161,15 +7392,13 @@
           <w:rFonts w:ascii="Arial" w:hAnsi="Arial" w:cs="Arial"/>
           <w:b/>
           <w:bCs/>
-          <w:lang w:val="en-US"/>
-        </w:rPr>
-      </w:pPr>
-      <w:r>
-        <w:rPr>
-          <w:rFonts w:ascii="Arial" w:hAnsi="Arial" w:cs="Arial"/>
-          <w:b/>
-          <w:bCs/>
-          <w:lang w:val="en-US"/>
+        </w:rPr>
+      </w:pPr>
+      <w:r>
+        <w:rPr>
+          <w:rFonts w:ascii="Arial" w:hAnsi="Arial" w:cs="Arial"/>
+          <w:b/>
+          <w:bCs/>
         </w:rPr>
         <w:t xml:space="preserve">ANEXOS </w:t>
       </w:r>
@@ -7181,125 +7410,109 @@
           <w:rFonts w:ascii="Arial" w:hAnsi="Arial" w:cs="Arial"/>
           <w:b/>
           <w:bCs/>
-          <w:lang w:val="en-US"/>
-        </w:rPr>
-      </w:pPr>
-    </w:p>
-    <w:p>
-      <w:pPr>
-        <w:rPr>
-          <w:rFonts w:ascii="Arial" w:hAnsi="Arial" w:cs="Arial"/>
-          <w:lang w:val="en-US"/>
-        </w:rPr>
-      </w:pPr>
-    </w:p>
-    <w:p>
-      <w:pPr>
-        <w:rPr>
-          <w:rFonts w:ascii="Arial" w:hAnsi="Arial" w:cs="Arial"/>
-          <w:lang w:val="en-US"/>
-        </w:rPr>
-      </w:pPr>
-    </w:p>
-    <w:p>
-      <w:pPr>
-        <w:rPr>
-          <w:rFonts w:ascii="Arial" w:hAnsi="Arial" w:cs="Arial"/>
-          <w:lang w:val="en-US"/>
-        </w:rPr>
-      </w:pPr>
-    </w:p>
-    <w:p>
-      <w:pPr>
-        <w:rPr>
-          <w:rFonts w:ascii="Arial" w:hAnsi="Arial" w:cs="Arial"/>
-          <w:lang w:val="en-US"/>
-        </w:rPr>
-      </w:pPr>
-    </w:p>
-    <w:p>
-      <w:pPr>
-        <w:rPr>
-          <w:rFonts w:ascii="Arial" w:hAnsi="Arial" w:cs="Arial"/>
-          <w:lang w:val="en-US"/>
-        </w:rPr>
-      </w:pPr>
-    </w:p>
-    <w:p>
-      <w:pPr>
-        <w:rPr>
-          <w:rFonts w:ascii="Arial" w:hAnsi="Arial" w:cs="Arial"/>
-          <w:lang w:val="en-US"/>
-        </w:rPr>
-      </w:pPr>
-    </w:p>
-    <w:p>
-      <w:pPr>
-        <w:rPr>
-          <w:rFonts w:ascii="Arial" w:hAnsi="Arial" w:cs="Arial"/>
-          <w:lang w:val="en-US"/>
-        </w:rPr>
-      </w:pPr>
-    </w:p>
-    <w:p>
-      <w:pPr>
-        <w:rPr>
-          <w:rFonts w:ascii="Arial" w:hAnsi="Arial" w:cs="Arial"/>
-          <w:lang w:val="en-US"/>
-        </w:rPr>
-      </w:pPr>
-    </w:p>
-    <w:p>
-      <w:pPr>
-        <w:rPr>
-          <w:rFonts w:ascii="Arial" w:hAnsi="Arial" w:cs="Arial"/>
-          <w:lang w:val="en-US"/>
-        </w:rPr>
-      </w:pPr>
-    </w:p>
-    <w:p>
-      <w:pPr>
-        <w:rPr>
-          <w:rFonts w:ascii="Arial" w:hAnsi="Arial" w:cs="Arial"/>
-          <w:lang w:val="en-US"/>
-        </w:rPr>
-      </w:pPr>
-    </w:p>
-    <w:p>
-      <w:pPr>
-        <w:rPr>
-          <w:rFonts w:ascii="Arial" w:hAnsi="Arial" w:cs="Arial"/>
-          <w:lang w:val="en-US"/>
-        </w:rPr>
-      </w:pPr>
-    </w:p>
-    <w:p>
-      <w:pPr>
-        <w:rPr>
-          <w:rFonts w:ascii="Arial" w:hAnsi="Arial" w:cs="Arial"/>
-          <w:lang w:val="en-US"/>
-        </w:rPr>
-      </w:pPr>
-    </w:p>
-    <w:p>
-      <w:pPr>
-        <w:rPr>
-          <w:rFonts w:ascii="Arial" w:hAnsi="Arial" w:cs="Arial"/>
-          <w:lang w:val="en-US"/>
-        </w:rPr>
-      </w:pPr>
-    </w:p>
-    <w:p>
-      <w:pPr>
-        <w:rPr>
-          <w:rFonts w:ascii="Arial" w:hAnsi="Arial" w:cs="Arial"/>
-          <w:lang w:val="en-US"/>
-        </w:rPr>
-      </w:pPr>
-      <w:r>
-        <w:rPr>
-          <w:rFonts w:ascii="Arial" w:hAnsi="Arial" w:cs="Arial"/>
-          <w:lang w:val="en-US"/>
+        </w:rPr>
+      </w:pPr>
+    </w:p>
+    <w:p>
+      <w:pPr>
+        <w:rPr>
+          <w:rFonts w:ascii="Arial" w:hAnsi="Arial" w:cs="Arial"/>
+        </w:rPr>
+      </w:pPr>
+    </w:p>
+    <w:p>
+      <w:pPr>
+        <w:rPr>
+          <w:rFonts w:ascii="Arial" w:hAnsi="Arial" w:cs="Arial"/>
+        </w:rPr>
+      </w:pPr>
+    </w:p>
+    <w:p>
+      <w:pPr>
+        <w:rPr>
+          <w:rFonts w:ascii="Arial" w:hAnsi="Arial" w:cs="Arial"/>
+        </w:rPr>
+      </w:pPr>
+    </w:p>
+    <w:p>
+      <w:pPr>
+        <w:rPr>
+          <w:rFonts w:ascii="Arial" w:hAnsi="Arial" w:cs="Arial"/>
+        </w:rPr>
+      </w:pPr>
+    </w:p>
+    <w:p>
+      <w:pPr>
+        <w:rPr>
+          <w:rFonts w:ascii="Arial" w:hAnsi="Arial" w:cs="Arial"/>
+        </w:rPr>
+      </w:pPr>
+    </w:p>
+    <w:p>
+      <w:pPr>
+        <w:rPr>
+          <w:rFonts w:ascii="Arial" w:hAnsi="Arial" w:cs="Arial"/>
+        </w:rPr>
+      </w:pPr>
+    </w:p>
+    <w:p>
+      <w:pPr>
+        <w:rPr>
+          <w:rFonts w:ascii="Arial" w:hAnsi="Arial" w:cs="Arial"/>
+        </w:rPr>
+      </w:pPr>
+    </w:p>
+    <w:p>
+      <w:pPr>
+        <w:rPr>
+          <w:rFonts w:ascii="Arial" w:hAnsi="Arial" w:cs="Arial"/>
+        </w:rPr>
+      </w:pPr>
+    </w:p>
+    <w:p>
+      <w:pPr>
+        <w:rPr>
+          <w:rFonts w:ascii="Arial" w:hAnsi="Arial" w:cs="Arial"/>
+        </w:rPr>
+      </w:pPr>
+    </w:p>
+    <w:p>
+      <w:pPr>
+        <w:rPr>
+          <w:rFonts w:ascii="Arial" w:hAnsi="Arial" w:cs="Arial"/>
+        </w:rPr>
+      </w:pPr>
+    </w:p>
+    <w:p>
+      <w:pPr>
+        <w:rPr>
+          <w:rFonts w:ascii="Arial" w:hAnsi="Arial" w:cs="Arial"/>
+        </w:rPr>
+      </w:pPr>
+    </w:p>
+    <w:p>
+      <w:pPr>
+        <w:rPr>
+          <w:rFonts w:ascii="Arial" w:hAnsi="Arial" w:cs="Arial"/>
+        </w:rPr>
+      </w:pPr>
+    </w:p>
+    <w:p>
+      <w:pPr>
+        <w:rPr>
+          <w:rFonts w:ascii="Arial" w:hAnsi="Arial" w:cs="Arial"/>
+        </w:rPr>
+      </w:pPr>
+    </w:p>
+    <w:p>
+      <w:pPr>
+        <w:rPr>
+          <w:rFonts w:ascii="Arial" w:hAnsi="Arial" w:cs="Arial"/>
+        </w:rPr>
+      </w:pPr>
+      <w:r>
+        <w:rPr>
+          <w:rFonts w:ascii="Arial" w:hAnsi="Arial" w:cs="Arial"/>
         </w:rPr>
         <w:br w:type="page"/>
       </w:r>
@@ -7309,7 +7522,6 @@
         <w:spacing w:line="480" w:lineRule="auto"/>
         <w:rPr>
           <w:rFonts w:ascii="Arial" w:hAnsi="Arial" w:cs="Arial"/>
-          <w:lang w:val="en-US"/>
         </w:rPr>
       </w:pPr>
     </w:p>
@@ -7318,7 +7530,6 @@
         <w:spacing w:line="480" w:lineRule="auto"/>
         <w:rPr>
           <w:rFonts w:ascii="Arial" w:hAnsi="Arial" w:cs="Arial"/>
-          <w:lang w:val="en-US"/>
         </w:rPr>
       </w:pPr>
     </w:p>
@@ -7327,7 +7538,6 @@
         <w:spacing w:line="480" w:lineRule="auto"/>
         <w:rPr>
           <w:rFonts w:ascii="Arial" w:hAnsi="Arial" w:cs="Arial"/>
-          <w:lang w:val="en-US"/>
         </w:rPr>
       </w:pPr>
     </w:p>
@@ -7341,15 +7551,13 @@
           <w:rFonts w:ascii="Arial" w:hAnsi="Arial" w:cs="Arial"/>
           <w:b/>
           <w:bCs/>
-          <w:lang w:val="en-US"/>
-        </w:rPr>
-      </w:pPr>
-      <w:r>
-        <w:rPr>
-          <w:rFonts w:ascii="Arial" w:hAnsi="Arial" w:cs="Arial"/>
-          <w:b/>
-          <w:bCs/>
-          <w:lang w:val="en-US"/>
+        </w:rPr>
+      </w:pPr>
+      <w:r>
+        <w:rPr>
+          <w:rFonts w:ascii="Arial" w:hAnsi="Arial" w:cs="Arial"/>
+          <w:b/>
+          <w:bCs/>
         </w:rPr>
         <w:t>REFERENCIAS</w:t>
       </w:r>
@@ -7361,59 +7569,256 @@
           <w:rFonts w:ascii="Arial" w:hAnsi="Arial" w:cs="Arial"/>
           <w:b/>
           <w:bCs/>
-          <w:lang w:val="en-US"/>
-        </w:rPr>
-      </w:pPr>
-    </w:p>
-    <w:p>
-      <w:pPr>
-        <w:jc w:val="center"/>
-        <w:rPr>
-          <w:rFonts w:ascii="Arial" w:hAnsi="Arial" w:cs="Arial"/>
-          <w:lang w:val="en-US"/>
-        </w:rPr>
-      </w:pPr>
-    </w:p>
-    <w:p>
-      <w:pPr>
-        <w:jc w:val="center"/>
-        <w:rPr>
-          <w:rFonts w:ascii="Arial" w:hAnsi="Arial" w:cs="Arial"/>
-          <w:lang w:val="en-US"/>
+        </w:rPr>
+      </w:pPr>
+    </w:p>
+    <w:p>
+      <w:pPr>
+        <w:jc w:val="center"/>
+        <w:rPr>
+          <w:rFonts w:ascii="Arial" w:hAnsi="Arial" w:cs="Arial"/>
+        </w:rPr>
+      </w:pPr>
+    </w:p>
+    <w:p>
+      <w:pPr>
+        <w:jc w:val="center"/>
+        <w:rPr>
+          <w:rFonts w:ascii="Arial" w:hAnsi="Arial" w:cs="Arial"/>
         </w:rPr>
       </w:pPr>
     </w:p>
     <w:p>
       <w:pPr>
         <w:pStyle w:val="NormalWeb"/>
-        <w:spacing w:before="240" w:beforeAutospacing="0" w:after="0" w:afterAutospacing="0"/>
+        <w:spacing w:before="240" w:beforeAutospacing="0"/>
         <w:ind w:left="567" w:hanging="567"/>
         <w:jc w:val="both"/>
         <w:rPr>
           <w:rFonts w:ascii="Arial" w:hAnsi="Arial" w:cs="Arial"/>
+        </w:rPr>
+      </w:pPr>
+      <w:r>
+        <w:rPr>
+          <w:rFonts w:ascii="Arial" w:hAnsi="Arial" w:cs="Arial"/>
+        </w:rPr>
+        <w:t xml:space="preserve">Albanese, D. (2012). Análisis y evaluación de </w:t>
+      </w:r>
+      <w:r>
+        <w:rPr>
+          <w:rFonts w:ascii="Arial" w:hAnsi="Arial" w:cs="Arial"/>
+        </w:rPr>
+        <w:t>riesgos:</w:t>
+      </w:r>
+      <w:r>
+        <w:rPr>
+          <w:rFonts w:ascii="Arial" w:hAnsi="Arial" w:cs="Arial"/>
+        </w:rPr>
+        <w:t xml:space="preserve"> aplicación de una matriz de riesgo en el marco de un plan de prevención contra el lavado de activos. </w:t>
+      </w:r>
+      <w:r>
+        <w:rPr>
+          <w:rFonts w:ascii="Arial" w:hAnsi="Arial" w:cs="Arial"/>
+          <w:i/>
+          <w:iCs/>
+        </w:rPr>
+        <w:t>Base</w:t>
+      </w:r>
+      <w:r>
+        <w:rPr>
+          <w:rFonts w:ascii="Arial" w:hAnsi="Arial" w:cs="Arial"/>
+        </w:rPr>
+        <w:t xml:space="preserve">. </w:t>
+      </w:r>
+      <w:r>
+        <w:rPr>
+          <w:rFonts w:ascii="Arial" w:hAnsi="Arial" w:cs="Arial"/>
+        </w:rPr>
+        <w:t>http://repositoriodigital.uns.edu.ar/handle/123456789/4099</w:t>
+      </w:r>
+    </w:p>
+    <w:p>
+      <w:pPr>
+        <w:pStyle w:val="NormalWeb"/>
+        <w:spacing w:before="240" w:beforeAutospacing="0"/>
+        <w:ind w:left="567" w:hanging="567"/>
+        <w:jc w:val="both"/>
+        <w:rPr>
+          <w:rFonts w:ascii="Arial" w:hAnsi="Arial" w:cs="Arial"/>
+        </w:rPr>
+      </w:pPr>
+      <w:r>
+        <w:rPr>
+          <w:rFonts w:ascii="Arial" w:hAnsi="Arial" w:cs="Arial"/>
+        </w:rPr>
+        <w:t xml:space="preserve">Blanco Cordero, I. (1997). </w:t>
+      </w:r>
+      <w:r>
+        <w:rPr>
+          <w:rFonts w:ascii="Arial" w:hAnsi="Arial" w:cs="Arial"/>
+          <w:i/>
+          <w:iCs/>
+        </w:rPr>
+        <w:t>El delito de blanqueo de capitales</w:t>
+      </w:r>
+      <w:r>
+        <w:rPr>
+          <w:rFonts w:ascii="Arial" w:hAnsi="Arial" w:cs="Arial"/>
+        </w:rPr>
+        <w:t>. Aranzadi</w:t>
+      </w:r>
+    </w:p>
+    <w:p>
+      <w:pPr>
+        <w:pStyle w:val="NormalWeb"/>
+        <w:spacing w:before="240" w:beforeAutospacing="0"/>
+        <w:ind w:left="567" w:hanging="567"/>
+        <w:jc w:val="both"/>
+        <w:rPr>
+          <w:rFonts w:ascii="Arial" w:hAnsi="Arial" w:cs="Arial"/>
+        </w:rPr>
+      </w:pPr>
+      <w:r>
+        <w:rPr>
+          <w:rFonts w:ascii="Arial" w:hAnsi="Arial" w:cs="Arial"/>
           <w:lang w:val="en-US"/>
         </w:rPr>
-      </w:pPr>
+        <w:t xml:space="preserve">United Nations Office on Drugs and Crime. </w:t>
+      </w:r>
+      <w:r>
+        <w:rPr>
+          <w:rFonts w:ascii="Arial" w:hAnsi="Arial" w:cs="Arial"/>
+        </w:rPr>
+        <w:t xml:space="preserve">(s.f.). </w:t>
+      </w:r>
+      <w:proofErr w:type="spellStart"/>
+      <w:r>
+        <w:rPr>
+          <w:rFonts w:ascii="Arial" w:hAnsi="Arial" w:cs="Arial"/>
+          <w:i/>
+          <w:iCs/>
+        </w:rPr>
+        <w:t>Overview</w:t>
+      </w:r>
+      <w:proofErr w:type="spellEnd"/>
+      <w:r>
+        <w:rPr>
+          <w:rFonts w:ascii="Arial" w:hAnsi="Arial" w:cs="Arial"/>
+        </w:rPr>
+        <w:t xml:space="preserve">. Consultado el 5 de octubre de 2026. </w:t>
+      </w:r>
+      <w:r>
+        <w:rPr>
+          <w:rFonts w:ascii="Arial" w:hAnsi="Arial" w:cs="Arial"/>
+        </w:rPr>
+        <w:t>https://www.unodc.org/unodc/en/money-laundering/overview.html</w:t>
+      </w:r>
+    </w:p>
+    <w:p>
+      <w:pPr>
+        <w:pStyle w:val="NormalWeb"/>
+        <w:spacing w:before="240" w:beforeAutospacing="0"/>
+        <w:ind w:left="567" w:hanging="567"/>
+        <w:jc w:val="both"/>
+        <w:rPr>
+          <w:rFonts w:ascii="Arial" w:hAnsi="Arial" w:cs="Arial"/>
+          <w:i/>
+          <w:iCs/>
+        </w:rPr>
+      </w:pPr>
+      <w:r>
+        <w:rPr>
+          <w:rFonts w:ascii="Arial" w:hAnsi="Arial" w:cs="Arial"/>
+        </w:rPr>
+        <w:t xml:space="preserve">Rocha-Salazar, J.-d.-J., Segovia-Vargas, M.-J. y Camacho-Miñano, M.-d.-M. (2021). </w:t>
+      </w:r>
       <w:r>
         <w:rPr>
           <w:rFonts w:ascii="Arial" w:hAnsi="Arial" w:cs="Arial"/>
           <w:lang w:val="en-US"/>
         </w:rPr>
-        <w:t>ACI Worldwide. (2026)</w:t>
-      </w:r>
-      <w:r>
+        <w:t xml:space="preserve">Money laundering and terrorism financing detection using neural networks and an abnormality indicator. </w:t>
+      </w:r>
+      <w:r>
+        <w:rPr>
+          <w:rFonts w:ascii="Arial" w:hAnsi="Arial" w:cs="Arial"/>
+          <w:i/>
+          <w:iCs/>
+        </w:rPr>
+        <w:t xml:space="preserve">Expert </w:t>
+      </w:r>
+      <w:proofErr w:type="spellStart"/>
+      <w:r>
+        <w:rPr>
+          <w:rFonts w:ascii="Arial" w:hAnsi="Arial" w:cs="Arial"/>
+          <w:i/>
+          <w:iCs/>
+        </w:rPr>
+        <w:t>Systems</w:t>
+      </w:r>
+      <w:proofErr w:type="spellEnd"/>
+      <w:r>
+        <w:rPr>
+          <w:rFonts w:ascii="Arial" w:hAnsi="Arial" w:cs="Arial"/>
+          <w:i/>
+          <w:iCs/>
+        </w:rPr>
+        <w:t xml:space="preserve"> </w:t>
+      </w:r>
+      <w:proofErr w:type="spellStart"/>
+      <w:r>
+        <w:rPr>
+          <w:rFonts w:ascii="Arial" w:hAnsi="Arial" w:cs="Arial"/>
+          <w:i/>
+          <w:iCs/>
+        </w:rPr>
+        <w:t>with</w:t>
+      </w:r>
+      <w:proofErr w:type="spellEnd"/>
+      <w:r>
+        <w:rPr>
+          <w:rFonts w:ascii="Arial" w:hAnsi="Arial" w:cs="Arial"/>
+          <w:i/>
+          <w:iCs/>
+        </w:rPr>
+        <w:t xml:space="preserve"> </w:t>
+      </w:r>
+      <w:proofErr w:type="spellStart"/>
+      <w:r>
+        <w:rPr>
+          <w:rFonts w:ascii="Arial" w:hAnsi="Arial" w:cs="Arial"/>
+          <w:i/>
+          <w:iCs/>
+        </w:rPr>
+        <w:t>Applications</w:t>
+      </w:r>
+      <w:proofErr w:type="spellEnd"/>
+      <w:r>
+        <w:rPr>
+          <w:rFonts w:ascii="Arial" w:hAnsi="Arial" w:cs="Arial"/>
+          <w:i/>
+          <w:iCs/>
+        </w:rPr>
+        <w:t>.</w:t>
+      </w:r>
+    </w:p>
+    <w:p>
+      <w:pPr>
+        <w:pStyle w:val="NormalWeb"/>
+        <w:spacing w:before="240" w:beforeAutospacing="0"/>
+        <w:ind w:left="567" w:hanging="567"/>
+        <w:jc w:val="both"/>
         <w:rPr>
           <w:rFonts w:ascii="Arial" w:hAnsi="Arial" w:cs="Arial"/>
           <w:lang w:val="en-US"/>
         </w:rPr>
-        <w:t>.</w:t>
-      </w:r>
+      </w:pPr>
       <w:r>
         <w:rPr>
           <w:rFonts w:ascii="Arial" w:hAnsi="Arial" w:cs="Arial"/>
           <w:lang w:val="en-US"/>
         </w:rPr>
-        <w:t xml:space="preserve"> </w:t>
+        <w:t xml:space="preserve">Financial Action Task Force. (2022). </w:t>
       </w:r>
       <w:r>
         <w:rPr>
@@ -7422,332 +7827,14 @@
           <w:iCs/>
           <w:lang w:val="en-US"/>
         </w:rPr>
-        <w:t>2026 fraud trends banks must prepare for</w:t>
+        <w:t>Report on the state of effectiveness and compliance with the FATF standards</w:t>
       </w:r>
       <w:r>
         <w:rPr>
           <w:rFonts w:ascii="Arial" w:hAnsi="Arial" w:cs="Arial"/>
           <w:lang w:val="en-US"/>
         </w:rPr>
-        <w:t>. http://www.aciworldwide.com/blog/2026-fraud-trends-banks-must-prepare-for</w:t>
-      </w:r>
-      <w:r>
-        <w:rPr>
-          <w:rFonts w:ascii="Arial" w:hAnsi="Arial" w:cs="Arial"/>
-          <w:lang w:val="en-US"/>
-        </w:rPr>
-        <w:t xml:space="preserve">  </w:t>
-      </w:r>
-    </w:p>
-    <w:p>
-      <w:pPr>
-        <w:pStyle w:val="NormalWeb"/>
-        <w:spacing w:before="240" w:beforeAutospacing="0" w:after="0" w:afterAutospacing="0"/>
-        <w:ind w:left="567" w:hanging="567"/>
-        <w:jc w:val="both"/>
-        <w:rPr>
-          <w:rFonts w:ascii="Arial" w:hAnsi="Arial" w:cs="Arial"/>
-        </w:rPr>
-      </w:pPr>
-      <w:r>
-        <w:rPr>
-          <w:rFonts w:ascii="Arial" w:hAnsi="Arial" w:cs="Arial"/>
-        </w:rPr>
-        <w:t xml:space="preserve">Estrada López, I.D. (2026). </w:t>
-      </w:r>
-      <w:r>
-        <w:rPr>
-          <w:rFonts w:ascii="Arial" w:hAnsi="Arial" w:cs="Arial"/>
-          <w:i/>
-          <w:iCs/>
-        </w:rPr>
-        <w:t xml:space="preserve">[Detector de concept </w:t>
-      </w:r>
-      <w:proofErr w:type="spellStart"/>
-      <w:r>
-        <w:rPr>
-          <w:rFonts w:ascii="Arial" w:hAnsi="Arial" w:cs="Arial"/>
-          <w:i/>
-          <w:iCs/>
-        </w:rPr>
-        <w:t>drift</w:t>
-      </w:r>
-      <w:proofErr w:type="spellEnd"/>
-      <w:r>
-        <w:rPr>
-          <w:rFonts w:ascii="Arial" w:hAnsi="Arial" w:cs="Arial"/>
-          <w:i/>
-          <w:iCs/>
-        </w:rPr>
-        <w:t xml:space="preserve"> para modelos de machine </w:t>
-      </w:r>
-      <w:proofErr w:type="spellStart"/>
-      <w:r>
-        <w:rPr>
-          <w:rFonts w:ascii="Arial" w:hAnsi="Arial" w:cs="Arial"/>
-          <w:i/>
-          <w:iCs/>
-        </w:rPr>
-        <w:t>learning</w:t>
-      </w:r>
-      <w:proofErr w:type="spellEnd"/>
-      <w:r>
-        <w:rPr>
-          <w:rFonts w:ascii="Arial" w:hAnsi="Arial" w:cs="Arial"/>
-          <w:i/>
-          <w:iCs/>
-        </w:rPr>
-        <w:t xml:space="preserve"> en producción]</w:t>
-      </w:r>
-      <w:r>
-        <w:rPr>
-          <w:rFonts w:ascii="Arial" w:hAnsi="Arial" w:cs="Arial"/>
-        </w:rPr>
-        <w:t xml:space="preserve">[Artículo].Universidad Autónoma de Nuevo León. </w:t>
-      </w:r>
-    </w:p>
-    <w:p>
-      <w:pPr>
-        <w:pStyle w:val="NormalWeb"/>
-        <w:spacing w:before="240" w:beforeAutospacing="0" w:after="0" w:afterAutospacing="0"/>
-        <w:ind w:left="567" w:hanging="567"/>
-        <w:jc w:val="both"/>
-        <w:rPr>
-          <w:rFonts w:ascii="Arial" w:hAnsi="Arial" w:cs="Arial"/>
-        </w:rPr>
-      </w:pPr>
-      <w:r>
-        <w:rPr>
-          <w:rFonts w:ascii="Arial" w:hAnsi="Arial" w:cs="Arial"/>
-        </w:rPr>
-        <w:t>Grupo de</w:t>
-      </w:r>
-      <w:r>
-        <w:rPr>
-          <w:rFonts w:ascii="Arial" w:hAnsi="Arial" w:cs="Arial"/>
-        </w:rPr>
-        <w:t xml:space="preserve"> Acción Financiera </w:t>
-      </w:r>
-      <w:r>
-        <w:rPr>
-          <w:rFonts w:ascii="Arial" w:hAnsi="Arial" w:cs="Arial"/>
-        </w:rPr>
-        <w:t>Internacional</w:t>
-      </w:r>
-      <w:r>
-        <w:rPr>
-          <w:rFonts w:ascii="Arial" w:hAnsi="Arial" w:cs="Arial"/>
-        </w:rPr>
-        <w:t xml:space="preserve">. </w:t>
-      </w:r>
-      <w:r>
-        <w:rPr>
-          <w:rFonts w:ascii="Arial" w:hAnsi="Arial" w:cs="Arial"/>
-        </w:rPr>
-        <w:t>(2018)</w:t>
-      </w:r>
-      <w:r>
-        <w:rPr>
-          <w:rFonts w:ascii="Arial" w:hAnsi="Arial" w:cs="Arial"/>
-        </w:rPr>
         <w:t>.</w:t>
-      </w:r>
-      <w:r>
-        <w:rPr>
-          <w:rFonts w:ascii="Arial" w:hAnsi="Arial" w:cs="Arial"/>
-        </w:rPr>
-        <w:t xml:space="preserve"> </w:t>
-      </w:r>
-      <w:r>
-        <w:rPr>
-          <w:rFonts w:ascii="Arial" w:hAnsi="Arial" w:cs="Arial"/>
-          <w:i/>
-          <w:iCs/>
-        </w:rPr>
-        <w:t>Medidas anti lavado y contra la financiación del terrorismo: Informe de evaluación mutua-México.</w:t>
-      </w:r>
-      <w:r>
-        <w:rPr>
-          <w:rFonts w:ascii="Arial" w:hAnsi="Arial" w:cs="Arial"/>
-        </w:rPr>
-        <w:t xml:space="preserve"> </w:t>
-      </w:r>
-      <w:r>
-        <w:rPr>
-          <w:rFonts w:ascii="Arial" w:hAnsi="Arial" w:cs="Arial"/>
-        </w:rPr>
-        <w:t>https://www.fatf-gafi.org/content/dam/fatf-gafi/mer/IEM-Mexico-2018-Spanish.pdf</w:t>
-      </w:r>
-      <w:r>
-        <w:rPr>
-          <w:rFonts w:ascii="Arial" w:hAnsi="Arial" w:cs="Arial"/>
-        </w:rPr>
-        <w:t xml:space="preserve"> </w:t>
-      </w:r>
-    </w:p>
-    <w:p>
-      <w:pPr>
-        <w:pStyle w:val="NormalWeb"/>
-        <w:spacing w:before="240" w:beforeAutospacing="0" w:after="0" w:afterAutospacing="0"/>
-        <w:ind w:left="567" w:hanging="567"/>
-        <w:jc w:val="both"/>
-        <w:rPr>
-          <w:rFonts w:ascii="Arial" w:hAnsi="Arial" w:cs="Arial"/>
-          <w:lang w:val="en-US"/>
-        </w:rPr>
-      </w:pPr>
-      <w:r>
-        <w:rPr>
-          <w:rFonts w:ascii="Arial" w:hAnsi="Arial" w:cs="Arial"/>
-        </w:rPr>
-        <w:t xml:space="preserve">Oficina de las Naciones Unidas contra la Droga y el Delito. </w:t>
-      </w:r>
-      <w:r>
-        <w:rPr>
-          <w:rFonts w:ascii="Arial" w:hAnsi="Arial" w:cs="Arial"/>
-          <w:lang w:val="en-US"/>
-        </w:rPr>
-        <w:t>(</w:t>
-      </w:r>
-      <w:proofErr w:type="spellStart"/>
-      <w:r>
-        <w:rPr>
-          <w:rFonts w:ascii="Arial" w:hAnsi="Arial" w:cs="Arial"/>
-          <w:lang w:val="en-US"/>
-        </w:rPr>
-        <w:t>s.f.</w:t>
-      </w:r>
-      <w:proofErr w:type="spellEnd"/>
-      <w:r>
-        <w:rPr>
-          <w:rFonts w:ascii="Arial" w:hAnsi="Arial" w:cs="Arial"/>
-          <w:lang w:val="en-US"/>
-        </w:rPr>
-        <w:t>)</w:t>
-      </w:r>
-      <w:r>
-        <w:rPr>
-          <w:rFonts w:ascii="Arial" w:hAnsi="Arial" w:cs="Arial"/>
-          <w:lang w:val="en-US"/>
-        </w:rPr>
-        <w:t>.</w:t>
-      </w:r>
-      <w:r>
-        <w:rPr>
-          <w:rFonts w:ascii="Arial" w:hAnsi="Arial" w:cs="Arial"/>
-          <w:lang w:val="en-US"/>
-        </w:rPr>
-        <w:t xml:space="preserve"> </w:t>
-      </w:r>
-      <w:r>
-        <w:rPr>
-          <w:rFonts w:ascii="Arial" w:hAnsi="Arial" w:cs="Arial"/>
-          <w:i/>
-          <w:iCs/>
-          <w:lang w:val="en-US"/>
-        </w:rPr>
-        <w:t>Money-Laundering</w:t>
-      </w:r>
-      <w:r>
-        <w:rPr>
-          <w:rFonts w:ascii="Arial" w:hAnsi="Arial" w:cs="Arial"/>
-          <w:lang w:val="en-US"/>
-        </w:rPr>
-        <w:t>.https://www.unodc.org/unodc/en/money</w:t>
-      </w:r>
-      <w:r>
-        <w:rPr>
-          <w:rFonts w:ascii="Arial" w:hAnsi="Arial" w:cs="Arial"/>
-          <w:lang w:val="en-US"/>
-        </w:rPr>
-        <w:t>-</w:t>
-      </w:r>
-      <w:r>
-        <w:rPr>
-          <w:rFonts w:ascii="Arial" w:hAnsi="Arial" w:cs="Arial"/>
-          <w:lang w:val="en-US"/>
-        </w:rPr>
-        <w:t>laundering/overview.html</w:t>
-      </w:r>
-      <w:r>
-        <w:rPr>
-          <w:rFonts w:ascii="Arial" w:hAnsi="Arial" w:cs="Arial"/>
-          <w:lang w:val="en-US"/>
-        </w:rPr>
-        <w:t xml:space="preserve"> </w:t>
-      </w:r>
-    </w:p>
-    <w:p>
-      <w:pPr>
-        <w:pStyle w:val="NormalWeb"/>
-        <w:spacing w:before="240" w:beforeAutospacing="0" w:after="0" w:afterAutospacing="0"/>
-        <w:ind w:left="567" w:hanging="567"/>
-        <w:jc w:val="both"/>
-        <w:rPr>
-          <w:rFonts w:ascii="Arial" w:hAnsi="Arial" w:cs="Arial"/>
-          <w:lang w:val="en-US"/>
-        </w:rPr>
-      </w:pPr>
-      <w:r>
-        <w:rPr>
-          <w:rFonts w:ascii="Arial" w:hAnsi="Arial" w:cs="Arial"/>
-          <w:lang w:val="en-US"/>
-        </w:rPr>
-        <w:t xml:space="preserve">Woychik, R.P., Camper, S.A., Lyons, R.H. y </w:t>
-      </w:r>
-      <w:proofErr w:type="spellStart"/>
-      <w:r>
-        <w:rPr>
-          <w:rFonts w:ascii="Arial" w:hAnsi="Arial" w:cs="Arial"/>
-          <w:lang w:val="en-US"/>
-        </w:rPr>
-        <w:t>Horowits</w:t>
-      </w:r>
-      <w:proofErr w:type="spellEnd"/>
-      <w:r>
-        <w:rPr>
-          <w:rFonts w:ascii="Arial" w:hAnsi="Arial" w:cs="Arial"/>
-          <w:lang w:val="en-US"/>
-        </w:rPr>
-        <w:t xml:space="preserve">, S. </w:t>
-      </w:r>
-      <w:r>
-        <w:rPr>
-          <w:rFonts w:ascii="Arial" w:hAnsi="Arial" w:cs="Arial"/>
-          <w:lang w:val="en-US"/>
-        </w:rPr>
-        <w:t xml:space="preserve">(1982). </w:t>
-      </w:r>
-      <w:r>
-        <w:rPr>
-          <w:rFonts w:ascii="Arial" w:hAnsi="Arial" w:cs="Arial"/>
-          <w:i/>
-          <w:lang w:val="en-US"/>
-        </w:rPr>
-        <w:t>Cloning and nucleotide sequencing of the bovine growth hormone gene</w:t>
-      </w:r>
-      <w:r>
-        <w:rPr>
-          <w:rFonts w:ascii="Arial" w:hAnsi="Arial" w:cs="Arial"/>
-          <w:lang w:val="en-US"/>
-        </w:rPr>
-        <w:t xml:space="preserve">. </w:t>
-      </w:r>
-      <w:proofErr w:type="spellStart"/>
-      <w:r>
-        <w:rPr>
-          <w:rFonts w:ascii="Arial" w:hAnsi="Arial" w:cs="Arial"/>
-          <w:lang w:val="en-US"/>
-        </w:rPr>
-        <w:t>Nucl</w:t>
-      </w:r>
-      <w:proofErr w:type="spellEnd"/>
-      <w:r>
-        <w:rPr>
-          <w:rFonts w:ascii="Arial" w:hAnsi="Arial" w:cs="Arial"/>
-          <w:lang w:val="en-US"/>
-        </w:rPr>
-        <w:t xml:space="preserve">. Acids Res. 10: 7197-7220. </w:t>
       </w:r>
     </w:p>
     <w:p>
@@ -9324,7 +9411,6 @@
   <w:style w:type="character" w:default="1" w:styleId="Fuentedeprrafopredeter">
     <w:name w:val="Default Paragraph Font"/>
     <w:uiPriority w:val="1"/>
-    <w:semiHidden/>
     <w:unhideWhenUsed/>
   </w:style>
   <w:style w:type="table" w:default="1" w:styleId="Tablanormal">
@@ -9494,6 +9580,18 @@
     <w:semiHidden/>
     <w:unhideWhenUsed/>
     <w:rsid w:val="0019145F"/>
+  </w:style>
+  <w:style w:type="character" w:styleId="Mencinsinresolver">
+    <w:name w:val="Unresolved Mention"/>
+    <w:basedOn w:val="Fuentedeprrafopredeter"/>
+    <w:uiPriority w:val="99"/>
+    <w:semiHidden/>
+    <w:unhideWhenUsed/>
+    <w:rsid w:val="0069008C"/>
+    <w:rPr>
+      <w:color w:val="605E5C"/>
+      <w:shd w:val="clear" w:color="auto" w:fill="E1DFDD"/>
+    </w:rPr>
   </w:style>
 </w:styles>
 </file>
@@ -9794,23 +9892,6 @@
 </file>
 
 <file path=customXml/item1.xml><?xml version="1.0" encoding="utf-8"?>
-<p:properties xmlns:p="http://schemas.microsoft.com/office/2006/metadata/properties" xmlns:xsi="http://www.w3.org/2001/XMLSchema-instance" xmlns:pc="http://schemas.microsoft.com/office/infopath/2007/PartnerControls">
-  <documentManagement>
-    <ReferenceId xmlns="d921d922-e586-4070-94cf-401e9ff1332c" xsi:nil="true"/>
-  </documentManagement>
-</p:properties>
-</file>
-
-<file path=customXml/item2.xml><?xml version="1.0" encoding="utf-8"?>
-<?mso-contentType ?>
-<FormTemplates xmlns="http://schemas.microsoft.com/sharepoint/v3/contenttype/forms">
-  <Display>DocumentLibraryForm</Display>
-  <Edit>DocumentLibraryForm</Edit>
-  <New>DocumentLibraryForm</New>
-</FormTemplates>
-</file>
-
-<file path=customXml/item3.xml><?xml version="1.0" encoding="utf-8"?>
 <ct:contentTypeSchema xmlns:ct="http://schemas.microsoft.com/office/2006/metadata/contentType" xmlns:ma="http://schemas.microsoft.com/office/2006/metadata/properties/metaAttributes" ct:_="" ma:_="" ma:contentTypeName="Document" ma:contentTypeID="0x0101006AF304BD0D0B7C4698522C08709C00BB" ma:contentTypeVersion="4" ma:contentTypeDescription="Create a new document." ma:contentTypeScope="" ma:versionID="d87bf246123dbc96f665515db9402ea3">
   <xsd:schema xmlns:xsd="http://www.w3.org/2001/XMLSchema" xmlns:xs="http://www.w3.org/2001/XMLSchema" xmlns:p="http://schemas.microsoft.com/office/2006/metadata/properties" xmlns:ns2="d921d922-e586-4070-94cf-401e9ff1332c" targetNamespace="http://schemas.microsoft.com/office/2006/metadata/properties" ma:root="true" ma:fieldsID="814706c9f71ffcccbcbebef487bdee00" ns2:_="">
     <xsd:import namespace="d921d922-e586-4070-94cf-401e9ff1332c"/>
@@ -9954,25 +10035,24 @@
 </ct:contentTypeSchema>
 </file>
 
-<file path=customXml/itemProps1.xml><?xml version="1.0" encoding="utf-8"?>
-<ds:datastoreItem xmlns:ds="http://schemas.openxmlformats.org/officeDocument/2006/customXml" ds:itemID="{0A485150-6D8C-4680-B13D-3C6444219884}">
-  <ds:schemaRefs>
-    <ds:schemaRef ds:uri="http://schemas.microsoft.com/office/2006/metadata/properties"/>
-    <ds:schemaRef ds:uri="http://schemas.microsoft.com/office/infopath/2007/PartnerControls"/>
-    <ds:schemaRef ds:uri="d921d922-e586-4070-94cf-401e9ff1332c"/>
-  </ds:schemaRefs>
-</ds:datastoreItem>
+<file path=customXml/item2.xml><?xml version="1.0" encoding="utf-8"?>
+<?mso-contentType ?>
+<FormTemplates xmlns="http://schemas.microsoft.com/sharepoint/v3/contenttype/forms">
+  <Display>DocumentLibraryForm</Display>
+  <Edit>DocumentLibraryForm</Edit>
+  <New>DocumentLibraryForm</New>
+</FormTemplates>
 </file>
 
-<file path=customXml/itemProps2.xml><?xml version="1.0" encoding="utf-8"?>
-<ds:datastoreItem xmlns:ds="http://schemas.openxmlformats.org/officeDocument/2006/customXml" ds:itemID="{C7DAC258-E4DA-446C-926C-E7A60E0F13CC}">
-  <ds:schemaRefs>
-    <ds:schemaRef ds:uri="http://schemas.microsoft.com/sharepoint/v3/contenttype/forms"/>
-  </ds:schemaRefs>
-</ds:datastoreItem>
+<file path=customXml/item3.xml><?xml version="1.0" encoding="utf-8"?>
+<p:properties xmlns:p="http://schemas.microsoft.com/office/2006/metadata/properties" xmlns:xsi="http://www.w3.org/2001/XMLSchema-instance" xmlns:pc="http://schemas.microsoft.com/office/infopath/2007/PartnerControls">
+  <documentManagement>
+    <ReferenceId xmlns="d921d922-e586-4070-94cf-401e9ff1332c" xsi:nil="true"/>
+  </documentManagement>
+</p:properties>
 </file>
 
-<file path=customXml/itemProps3.xml><?xml version="1.0" encoding="utf-8"?>
+<file path=customXml/itemProps1.xml><?xml version="1.0" encoding="utf-8"?>
 <ds:datastoreItem xmlns:ds="http://schemas.openxmlformats.org/officeDocument/2006/customXml" ds:itemID="{66617E81-A932-4195-A0D0-208078D8F9E1}">
   <ds:schemaRefs>
     <ds:schemaRef ds:uri="http://schemas.microsoft.com/office/2006/metadata/contentType"/>
@@ -9988,4 +10068,22 @@
     <ds:schemaRef ds:uri="http://schemas.microsoft.com/internal/obd"/>
   </ds:schemaRefs>
 </ds:datastoreItem>
+</file>
+
+<file path=customXml/itemProps2.xml><?xml version="1.0" encoding="utf-8"?>
+<ds:datastoreItem xmlns:ds="http://schemas.openxmlformats.org/officeDocument/2006/customXml" ds:itemID="{C7DAC258-E4DA-446C-926C-E7A60E0F13CC}">
+  <ds:schemaRefs>
+    <ds:schemaRef ds:uri="http://schemas.microsoft.com/sharepoint/v3/contenttype/forms"/>
+  </ds:schemaRefs>
+</ds:datastoreItem>
+</file>
+
+<file path=customXml/itemProps3.xml><?xml version="1.0" encoding="utf-8"?>
+<ds:datastoreItem xmlns:ds="http://schemas.openxmlformats.org/officeDocument/2006/customXml" ds:itemID="{0A485150-6D8C-4680-B13D-3C6444219884}">
+  <ds:schemaRefs>
+    <ds:schemaRef ds:uri="http://schemas.microsoft.com/office/2006/metadata/properties"/>
+    <ds:schemaRef ds:uri="http://schemas.microsoft.com/office/infopath/2007/PartnerControls"/>
+    <ds:schemaRef ds:uri="d921d922-e586-4070-94cf-401e9ff1332c"/>
+  </ds:schemaRefs>
+</ds:datastoreItem>
 </file>
</xml_diff>

<commit_message>
Genero el archivo para la tarea
</commit_message>
<xml_diff>
--- a/Revisiones-Tesina/Delimitacion-Del-Problema/Revisado/ANTEPROYECTO AV1 GUSTAVO DE JESUS ESCOBAR MATA.docx
+++ b/Revisiones-Tesina/Delimitacion-Del-Problema/Revisado/ANTEPROYECTO AV1 GUSTAVO DE JESUS ESCOBAR MATA.docx
@@ -801,107 +801,57 @@
           <w:rFonts w:ascii="Arial" w:hAnsi="Arial" w:cs="Arial"/>
           <w:lang w:val="es-ES"/>
         </w:rPr>
-        <w:t xml:space="preserve">(Título y </w:t>
-      </w:r>
-      <w:proofErr w:type="gramStart"/>
-      <w:r>
-        <w:rPr>
-          <w:rFonts w:ascii="Arial" w:hAnsi="Arial" w:cs="Arial"/>
-          <w:lang w:val="es-ES"/>
-        </w:rPr>
-        <w:t xml:space="preserve">nombre)   </w:t>
-      </w:r>
-      <w:proofErr w:type="gramEnd"/>
-      <w:r>
-        <w:rPr>
-          <w:rFonts w:ascii="Arial" w:hAnsi="Arial" w:cs="Arial"/>
-          <w:lang w:val="es-ES"/>
-        </w:rPr>
-        <w:t xml:space="preserve">                                   </w:t>
-      </w:r>
-      <w:proofErr w:type="gramStart"/>
-      <w:r>
-        <w:rPr>
-          <w:rFonts w:ascii="Arial" w:hAnsi="Arial" w:cs="Arial"/>
-          <w:lang w:val="es-ES"/>
-        </w:rPr>
-        <w:t xml:space="preserve">   (</w:t>
-      </w:r>
-      <w:proofErr w:type="gramEnd"/>
-      <w:r>
-        <w:rPr>
-          <w:rFonts w:ascii="Arial" w:hAnsi="Arial" w:cs="Arial"/>
-          <w:lang w:val="es-ES"/>
-        </w:rPr>
-        <w:t>Título y nombre)</w:t>
-      </w:r>
-    </w:p>
-    <w:p>
-      <w:pPr>
-        <w:jc w:val="center"/>
-        <w:rPr>
-          <w:rFonts w:ascii="Arial" w:hAnsi="Arial" w:cs="Arial"/>
-          <w:lang w:val="es-ES"/>
-        </w:rPr>
-      </w:pPr>
-      <w:r>
-        <w:rPr>
-          <w:rFonts w:ascii="Arial" w:hAnsi="Arial" w:cs="Arial"/>
-          <w:lang w:val="es-ES"/>
-        </w:rPr>
-        <w:t xml:space="preserve">Revisor                                                        </w:t>
-      </w:r>
-      <w:proofErr w:type="spellStart"/>
-      <w:r>
-        <w:rPr>
-          <w:rFonts w:ascii="Arial" w:hAnsi="Arial" w:cs="Arial"/>
-          <w:lang w:val="es-ES"/>
-        </w:rPr>
-        <w:t>Revisor</w:t>
-      </w:r>
-      <w:proofErr w:type="spellEnd"/>
-    </w:p>
-    <w:p>
-      <w:pPr>
-        <w:jc w:val="center"/>
-        <w:rPr>
-          <w:rFonts w:ascii="Arial" w:hAnsi="Arial" w:cs="Arial"/>
-          <w:lang w:val="es-ES"/>
-        </w:rPr>
-      </w:pPr>
-    </w:p>
-    <w:p>
-      <w:pPr>
-        <w:jc w:val="center"/>
-        <w:rPr>
-          <w:rFonts w:ascii="Arial" w:hAnsi="Arial" w:cs="Arial"/>
-          <w:lang w:val="es-ES"/>
-        </w:rPr>
-      </w:pPr>
-    </w:p>
-    <w:p>
-      <w:pPr>
-        <w:jc w:val="center"/>
-        <w:rPr>
-          <w:rFonts w:ascii="Arial" w:hAnsi="Arial" w:cs="Arial"/>
-          <w:lang w:val="es-ES"/>
-        </w:rPr>
-      </w:pPr>
-      <w:proofErr w:type="spellStart"/>
-      <w:r>
-        <w:rPr>
-          <w:rFonts w:ascii="Arial" w:hAnsi="Arial" w:cs="Arial"/>
-          <w:lang w:val="es-ES"/>
-        </w:rPr>
-        <w:t>Vo.Bo</w:t>
-      </w:r>
-      <w:proofErr w:type="spellEnd"/>
-      <w:r>
-        <w:rPr>
-          <w:rFonts w:ascii="Arial" w:hAnsi="Arial" w:cs="Arial"/>
-          <w:lang w:val="es-ES"/>
-        </w:rPr>
-        <w:t>.</w:t>
+        <w:t>(Título y nombre)                                         (Título y nombre)</w:t>
+      </w:r>
+    </w:p>
+    <w:p>
+      <w:pPr>
+        <w:jc w:val="center"/>
+        <w:rPr>
+          <w:rFonts w:ascii="Arial" w:hAnsi="Arial" w:cs="Arial"/>
+          <w:lang w:val="es-ES"/>
+        </w:rPr>
+      </w:pPr>
+      <w:r>
+        <w:rPr>
+          <w:rFonts w:ascii="Arial" w:hAnsi="Arial" w:cs="Arial"/>
+          <w:lang w:val="es-ES"/>
+        </w:rPr>
+        <w:t>Revisor                                                        Revisor</w:t>
+      </w:r>
+    </w:p>
+    <w:p>
+      <w:pPr>
+        <w:jc w:val="center"/>
+        <w:rPr>
+          <w:rFonts w:ascii="Arial" w:hAnsi="Arial" w:cs="Arial"/>
+          <w:lang w:val="es-ES"/>
+        </w:rPr>
+      </w:pPr>
+    </w:p>
+    <w:p>
+      <w:pPr>
+        <w:jc w:val="center"/>
+        <w:rPr>
+          <w:rFonts w:ascii="Arial" w:hAnsi="Arial" w:cs="Arial"/>
+          <w:lang w:val="es-ES"/>
+        </w:rPr>
+      </w:pPr>
+    </w:p>
+    <w:p>
+      <w:pPr>
+        <w:jc w:val="center"/>
+        <w:rPr>
+          <w:rFonts w:ascii="Arial" w:hAnsi="Arial" w:cs="Arial"/>
+          <w:lang w:val="es-ES"/>
+        </w:rPr>
+      </w:pPr>
+      <w:r>
+        <w:rPr>
+          <w:rFonts w:ascii="Arial" w:hAnsi="Arial" w:cs="Arial"/>
+          <w:lang w:val="es-ES"/>
+        </w:rPr>
+        <w:t>Vo.Bo.</w:t>
       </w:r>
     </w:p>
     <w:p>
@@ -1449,9 +1399,20 @@
         <w:rPr>
           <w:rFonts w:ascii="Arial" w:hAnsi="Arial" w:cs="Arial"/>
         </w:rPr>
-        <w:t>(Subtítulo)……</w:t>
-      </w:r>
-      <w:proofErr w:type="gramStart"/>
+        <w:t>(Subtítulo)…………</w:t>
+      </w:r>
+      <w:r>
+        <w:rPr>
+          <w:rFonts w:ascii="Arial" w:hAnsi="Arial" w:cs="Arial"/>
+        </w:rPr>
+        <w:t>..</w:t>
+      </w:r>
+      <w:r>
+        <w:rPr>
+          <w:rFonts w:ascii="Arial" w:hAnsi="Arial" w:cs="Arial"/>
+        </w:rPr>
+        <w:t>……………………………………</w:t>
+      </w:r>
       <w:r>
         <w:rPr>
           <w:rFonts w:ascii="Arial" w:hAnsi="Arial" w:cs="Arial"/>
@@ -1462,140 +1423,83 @@
         <w:rPr>
           <w:rFonts w:ascii="Arial" w:hAnsi="Arial" w:cs="Arial"/>
         </w:rPr>
+        <w:t>…….</w:t>
+      </w:r>
+      <w:r>
+        <w:rPr>
+          <w:rFonts w:ascii="Arial" w:hAnsi="Arial" w:cs="Arial"/>
+        </w:rPr>
+        <w:t>1</w:t>
+      </w:r>
+    </w:p>
+    <w:p>
+      <w:pPr>
+        <w:rPr>
+          <w:rFonts w:ascii="Arial" w:hAnsi="Arial" w:cs="Arial"/>
+        </w:rPr>
+      </w:pPr>
+      <w:r>
+        <w:rPr>
+          <w:rFonts w:ascii="Arial" w:hAnsi="Arial" w:cs="Arial"/>
+          <w:lang w:val="es-ES"/>
+        </w:rPr>
+        <w:tab/>
+      </w:r>
+      <w:r>
+        <w:rPr>
+          <w:rFonts w:ascii="Arial" w:hAnsi="Arial" w:cs="Arial"/>
+        </w:rPr>
+        <w:t xml:space="preserve">           1.1.1 (Subtítulo)………………………………</w:t>
+      </w:r>
+      <w:r>
+        <w:rPr>
+          <w:rFonts w:ascii="Arial" w:hAnsi="Arial" w:cs="Arial"/>
+        </w:rPr>
+        <w:t>……………………</w:t>
+      </w:r>
+      <w:r>
+        <w:rPr>
+          <w:rFonts w:ascii="Arial" w:hAnsi="Arial" w:cs="Arial"/>
+        </w:rPr>
         <w:t>.</w:t>
       </w:r>
-      <w:proofErr w:type="gramEnd"/>
+      <w:r>
+        <w:rPr>
+          <w:rFonts w:ascii="Arial" w:hAnsi="Arial" w:cs="Arial"/>
+        </w:rPr>
+        <w:t>1</w:t>
+      </w:r>
+    </w:p>
+    <w:p>
+      <w:pPr>
+        <w:rPr>
+          <w:rFonts w:ascii="Arial" w:hAnsi="Arial" w:cs="Arial"/>
+        </w:rPr>
+      </w:pPr>
+      <w:r>
+        <w:rPr>
+          <w:rFonts w:ascii="Arial" w:hAnsi="Arial" w:cs="Arial"/>
+        </w:rPr>
+        <w:t xml:space="preserve">             1.2   (Subtítulo)……………………………………………………</w:t>
+      </w:r>
+      <w:r>
+        <w:rPr>
+          <w:rFonts w:ascii="Arial" w:hAnsi="Arial" w:cs="Arial"/>
+        </w:rPr>
+        <w:t>…….</w:t>
+      </w:r>
+      <w:r>
+        <w:rPr>
+          <w:rFonts w:ascii="Arial" w:hAnsi="Arial" w:cs="Arial"/>
+        </w:rPr>
+        <w:t>..</w:t>
+      </w:r>
       <w:r>
         <w:rPr>
           <w:rFonts w:ascii="Arial" w:hAnsi="Arial" w:cs="Arial"/>
         </w:rPr>
         <w:t>.</w:t>
       </w:r>
-      <w:r>
-        <w:rPr>
-          <w:rFonts w:ascii="Arial" w:hAnsi="Arial" w:cs="Arial"/>
-        </w:rPr>
-        <w:t>……………………………………</w:t>
-      </w:r>
-      <w:r>
-        <w:rPr>
-          <w:rFonts w:ascii="Arial" w:hAnsi="Arial" w:cs="Arial"/>
-        </w:rPr>
-        <w:t>……</w:t>
-      </w:r>
-      <w:proofErr w:type="gramStart"/>
-      <w:r>
-        <w:rPr>
-          <w:rFonts w:ascii="Arial" w:hAnsi="Arial" w:cs="Arial"/>
-        </w:rPr>
-        <w:t>…….</w:t>
-      </w:r>
-      <w:proofErr w:type="gramEnd"/>
-      <w:r>
-        <w:rPr>
-          <w:rFonts w:ascii="Arial" w:hAnsi="Arial" w:cs="Arial"/>
-        </w:rPr>
-        <w:t>1</w:t>
-      </w:r>
-    </w:p>
-    <w:p>
-      <w:pPr>
-        <w:rPr>
-          <w:rFonts w:ascii="Arial" w:hAnsi="Arial" w:cs="Arial"/>
-        </w:rPr>
-      </w:pPr>
-      <w:r>
-        <w:rPr>
-          <w:rFonts w:ascii="Arial" w:hAnsi="Arial" w:cs="Arial"/>
-          <w:lang w:val="es-ES"/>
-        </w:rPr>
-        <w:tab/>
-      </w:r>
-      <w:r>
-        <w:rPr>
-          <w:rFonts w:ascii="Arial" w:hAnsi="Arial" w:cs="Arial"/>
-        </w:rPr>
-        <w:t xml:space="preserve">           1.1.1 (Subtítulo)………………………………</w:t>
-      </w:r>
-      <w:r>
-        <w:rPr>
-          <w:rFonts w:ascii="Arial" w:hAnsi="Arial" w:cs="Arial"/>
-        </w:rPr>
-        <w:t>………………</w:t>
-      </w:r>
-      <w:proofErr w:type="gramStart"/>
-      <w:r>
-        <w:rPr>
-          <w:rFonts w:ascii="Arial" w:hAnsi="Arial" w:cs="Arial"/>
-        </w:rPr>
-        <w:t>……</w:t>
-      </w:r>
-      <w:r>
-        <w:rPr>
-          <w:rFonts w:ascii="Arial" w:hAnsi="Arial" w:cs="Arial"/>
-        </w:rPr>
-        <w:t>.</w:t>
-      </w:r>
-      <w:proofErr w:type="gramEnd"/>
-      <w:r>
-        <w:rPr>
-          <w:rFonts w:ascii="Arial" w:hAnsi="Arial" w:cs="Arial"/>
-        </w:rPr>
-        <w:t>1</w:t>
-      </w:r>
-    </w:p>
-    <w:p>
-      <w:pPr>
-        <w:rPr>
-          <w:rFonts w:ascii="Arial" w:hAnsi="Arial" w:cs="Arial"/>
-        </w:rPr>
-      </w:pPr>
-      <w:r>
-        <w:rPr>
-          <w:rFonts w:ascii="Arial" w:hAnsi="Arial" w:cs="Arial"/>
-        </w:rPr>
-        <w:t xml:space="preserve">             1.2</w:t>
-      </w:r>
-      <w:proofErr w:type="gramStart"/>
-      <w:r>
-        <w:rPr>
-          <w:rFonts w:ascii="Arial" w:hAnsi="Arial" w:cs="Arial"/>
-        </w:rPr>
-        <w:t xml:space="preserve">   (</w:t>
-      </w:r>
-      <w:proofErr w:type="gramEnd"/>
-      <w:r>
-        <w:rPr>
-          <w:rFonts w:ascii="Arial" w:hAnsi="Arial" w:cs="Arial"/>
-        </w:rPr>
-        <w:t>Subtítulo)……………………………………………………</w:t>
-      </w:r>
-      <w:r>
-        <w:rPr>
-          <w:rFonts w:ascii="Arial" w:hAnsi="Arial" w:cs="Arial"/>
-        </w:rPr>
-        <w:t>…</w:t>
-      </w:r>
-      <w:proofErr w:type="gramStart"/>
-      <w:r>
-        <w:rPr>
-          <w:rFonts w:ascii="Arial" w:hAnsi="Arial" w:cs="Arial"/>
-        </w:rPr>
-        <w:t>….</w:t>
-      </w:r>
-      <w:r>
-        <w:rPr>
-          <w:rFonts w:ascii="Arial" w:hAnsi="Arial" w:cs="Arial"/>
-        </w:rPr>
-        <w:t>..</w:t>
-      </w:r>
-      <w:r>
-        <w:rPr>
-          <w:rFonts w:ascii="Arial" w:hAnsi="Arial" w:cs="Arial"/>
-        </w:rPr>
-        <w:t>.</w:t>
-      </w:r>
-      <w:proofErr w:type="gramEnd"/>
       <w:r>
         <w:rPr>
           <w:rFonts w:ascii="Arial" w:hAnsi="Arial" w:cs="Arial"/>
@@ -1711,15 +1615,7 @@
           <w:rFonts w:ascii="Arial" w:hAnsi="Arial" w:cs="Arial"/>
           <w:lang w:val="es-ES"/>
         </w:rPr>
-        <w:t>2.1</w:t>
-      </w:r>
-      <w:proofErr w:type="gramStart"/>
-      <w:r>
-        <w:rPr>
-          <w:rFonts w:ascii="Arial" w:hAnsi="Arial" w:cs="Arial"/>
-          <w:lang w:val="es-ES"/>
-        </w:rPr>
-        <w:t xml:space="preserve">  </w:t>
+        <w:t xml:space="preserve">2.1  </w:t>
       </w:r>
       <w:r>
         <w:rPr>
@@ -1733,15 +1629,7 @@
           <w:rFonts w:ascii="Arial" w:hAnsi="Arial" w:cs="Arial"/>
           <w:lang w:val="es-ES"/>
         </w:rPr>
-        <w:t>(</w:t>
-      </w:r>
-      <w:proofErr w:type="gramEnd"/>
-      <w:r>
-        <w:rPr>
-          <w:rFonts w:ascii="Arial" w:hAnsi="Arial" w:cs="Arial"/>
-          <w:lang w:val="es-ES"/>
-        </w:rPr>
-        <w:t xml:space="preserve">Subtítulo) </w:t>
+        <w:t xml:space="preserve">(Subtítulo) </w:t>
       </w:r>
       <w:r>
         <w:rPr>
@@ -1834,21 +1722,7 @@
         <w:rPr>
           <w:rFonts w:ascii="Arial" w:hAnsi="Arial" w:cs="Arial"/>
         </w:rPr>
-        <w:t>4.    FORMULACIÓN DE OBJETIVOS……………………</w:t>
-      </w:r>
-      <w:proofErr w:type="gramStart"/>
-      <w:r>
-        <w:rPr>
-          <w:rFonts w:ascii="Arial" w:hAnsi="Arial" w:cs="Arial"/>
-        </w:rPr>
-        <w:t>…….</w:t>
-      </w:r>
-      <w:proofErr w:type="gramEnd"/>
-      <w:r>
-        <w:rPr>
-          <w:rFonts w:ascii="Arial" w:hAnsi="Arial" w:cs="Arial"/>
-        </w:rPr>
-        <w:t>.…</w:t>
+        <w:t>4.    FORMULACIÓN DE OBJETIVOS…………………………..…</w:t>
       </w:r>
       <w:r>
         <w:rPr>
@@ -1925,36 +1799,14 @@
         <w:rPr>
           <w:rFonts w:ascii="Arial" w:hAnsi="Arial" w:cs="Arial"/>
         </w:rPr>
-        <w:t>6.    METODOLOGÍA……………………………………………</w:t>
-      </w:r>
-      <w:proofErr w:type="gramStart"/>
-      <w:r>
-        <w:rPr>
-          <w:rFonts w:ascii="Arial" w:hAnsi="Arial" w:cs="Arial"/>
-        </w:rPr>
-        <w:t>…....</w:t>
-      </w:r>
-      <w:proofErr w:type="gramEnd"/>
-      <w:r>
-        <w:rPr>
-          <w:rFonts w:ascii="Arial" w:hAnsi="Arial" w:cs="Arial"/>
-        </w:rPr>
-        <w:t>…</w:t>
-      </w:r>
-      <w:r>
-        <w:rPr>
-          <w:rFonts w:ascii="Arial" w:hAnsi="Arial" w:cs="Arial"/>
-        </w:rPr>
-        <w:t>……</w:t>
-      </w:r>
-      <w:proofErr w:type="gramStart"/>
-      <w:r>
-        <w:rPr>
-          <w:rFonts w:ascii="Arial" w:hAnsi="Arial" w:cs="Arial"/>
-        </w:rPr>
-        <w:t>…....</w:t>
-      </w:r>
-      <w:proofErr w:type="gramEnd"/>
+        <w:t>6.    METODOLOGÍA………………………………………………....…</w:t>
+      </w:r>
+      <w:r>
+        <w:rPr>
+          <w:rFonts w:ascii="Arial" w:hAnsi="Arial" w:cs="Arial"/>
+        </w:rPr>
+        <w:t>………....</w:t>
+      </w:r>
       <w:r>
         <w:rPr>
           <w:rFonts w:ascii="Arial" w:hAnsi="Arial" w:cs="Arial"/>
@@ -2101,21 +1953,7 @@
         <w:rPr>
           <w:rFonts w:ascii="Arial" w:hAnsi="Arial" w:cs="Arial"/>
         </w:rPr>
-        <w:t>…………………………………………</w:t>
-      </w:r>
-      <w:proofErr w:type="gramStart"/>
-      <w:r>
-        <w:rPr>
-          <w:rFonts w:ascii="Arial" w:hAnsi="Arial" w:cs="Arial"/>
-        </w:rPr>
-        <w:t>…....</w:t>
-      </w:r>
-      <w:proofErr w:type="gramEnd"/>
-      <w:r>
-        <w:rPr>
-          <w:rFonts w:ascii="Arial" w:hAnsi="Arial" w:cs="Arial"/>
-        </w:rPr>
-        <w:t>.……….......</w:t>
+        <w:t>…………………………………………….....……….......</w:t>
       </w:r>
       <w:r>
         <w:rPr>
@@ -2172,21 +2010,7 @@
         <w:rPr>
           <w:rFonts w:ascii="Arial" w:hAnsi="Arial" w:cs="Arial"/>
         </w:rPr>
-        <w:t>...........…………………………………………</w:t>
-      </w:r>
-      <w:proofErr w:type="gramStart"/>
-      <w:r>
-        <w:rPr>
-          <w:rFonts w:ascii="Arial" w:hAnsi="Arial" w:cs="Arial"/>
-        </w:rPr>
-        <w:t>…....</w:t>
-      </w:r>
-      <w:proofErr w:type="gramEnd"/>
-      <w:r>
-        <w:rPr>
-          <w:rFonts w:ascii="Arial" w:hAnsi="Arial" w:cs="Arial"/>
-        </w:rPr>
-        <w:t>.……….............</w:t>
+        <w:t>...........…………………………………………….....……….............</w:t>
       </w:r>
       <w:r>
         <w:rPr>
@@ -2487,20 +2311,17 @@
                 <w:noProof/>
                 <w:webHidden/>
               </w:rPr>
-            </w:r>
-            <w:r>
-              <w:rPr>
-                <w:noProof/>
-                <w:webHidden/>
-              </w:rPr>
               <w:fldChar w:fldCharType="separate"/>
             </w:r>
             <w:r>
               <w:rPr>
+                <w:b/>
+                <w:bCs/>
                 <w:noProof/>
                 <w:webHidden/>
+                <w:lang w:val="es-ES"/>
               </w:rPr>
-              <w:t>9</w:t>
+              <w:t>¡Error! Marcador no definido.</w:t>
             </w:r>
             <w:r>
               <w:rPr>
@@ -2586,20 +2407,17 @@
                 <w:noProof/>
                 <w:webHidden/>
               </w:rPr>
-            </w:r>
-            <w:r>
-              <w:rPr>
-                <w:noProof/>
-                <w:webHidden/>
-              </w:rPr>
               <w:fldChar w:fldCharType="separate"/>
             </w:r>
             <w:r>
               <w:rPr>
+                <w:b/>
+                <w:bCs/>
                 <w:noProof/>
                 <w:webHidden/>
+                <w:lang w:val="es-ES"/>
               </w:rPr>
-              <w:t>10</w:t>
+              <w:t>¡Error! Marcador no definido.</w:t>
             </w:r>
             <w:r>
               <w:rPr>
@@ -2697,7 +2515,7 @@
                 <w:noProof/>
                 <w:webHidden/>
               </w:rPr>
-              <w:t>11</w:t>
+              <w:t>2</w:t>
             </w:r>
             <w:r>
               <w:rPr>
@@ -2795,7 +2613,7 @@
                 <w:noProof/>
                 <w:webHidden/>
               </w:rPr>
-              <w:t>12</w:t>
+              <w:t>2</w:t>
             </w:r>
             <w:r>
               <w:rPr>
@@ -2880,20 +2698,17 @@
                 <w:noProof/>
                 <w:webHidden/>
               </w:rPr>
-            </w:r>
-            <w:r>
-              <w:rPr>
-                <w:noProof/>
-                <w:webHidden/>
-              </w:rPr>
               <w:fldChar w:fldCharType="separate"/>
             </w:r>
             <w:r>
               <w:rPr>
+                <w:b/>
+                <w:bCs/>
                 <w:noProof/>
                 <w:webHidden/>
+                <w:lang w:val="es-ES"/>
               </w:rPr>
-              <w:t>13</w:t>
+              <w:t>¡Error! Marcador no definido.</w:t>
             </w:r>
             <w:r>
               <w:rPr>
@@ -3285,20 +3100,17 @@
                 <w:noProof/>
                 <w:webHidden/>
               </w:rPr>
-            </w:r>
-            <w:r>
-              <w:rPr>
-                <w:noProof/>
-                <w:webHidden/>
-              </w:rPr>
               <w:fldChar w:fldCharType="separate"/>
             </w:r>
             <w:r>
               <w:rPr>
+                <w:b/>
+                <w:bCs/>
                 <w:noProof/>
                 <w:webHidden/>
+                <w:lang w:val="es-ES"/>
               </w:rPr>
-              <w:t>9</w:t>
+              <w:t>¡Error! Marcador no definido.</w:t>
             </w:r>
             <w:r>
               <w:rPr>
@@ -3364,20 +3176,17 @@
                 <w:noProof/>
                 <w:webHidden/>
               </w:rPr>
-            </w:r>
-            <w:r>
-              <w:rPr>
-                <w:noProof/>
-                <w:webHidden/>
-              </w:rPr>
               <w:fldChar w:fldCharType="separate"/>
             </w:r>
             <w:r>
               <w:rPr>
+                <w:b/>
+                <w:bCs/>
                 <w:noProof/>
                 <w:webHidden/>
+                <w:lang w:val="es-ES"/>
               </w:rPr>
-              <w:t>10</w:t>
+              <w:t>¡Error! Marcador no definido.</w:t>
             </w:r>
             <w:r>
               <w:rPr>
@@ -3455,7 +3264,7 @@
                 <w:noProof/>
                 <w:webHidden/>
               </w:rPr>
-              <w:t>11</w:t>
+              <w:t>2</w:t>
             </w:r>
             <w:r>
               <w:rPr>
@@ -3533,7 +3342,7 @@
                 <w:noProof/>
                 <w:webHidden/>
               </w:rPr>
-              <w:t>12</w:t>
+              <w:t>2</w:t>
             </w:r>
             <w:r>
               <w:rPr>
@@ -3598,20 +3407,17 @@
                 <w:noProof/>
                 <w:webHidden/>
               </w:rPr>
-            </w:r>
-            <w:r>
-              <w:rPr>
-                <w:noProof/>
-                <w:webHidden/>
-              </w:rPr>
               <w:fldChar w:fldCharType="separate"/>
             </w:r>
             <w:r>
               <w:rPr>
+                <w:b/>
+                <w:bCs/>
                 <w:noProof/>
                 <w:webHidden/>
+                <w:lang w:val="es-ES"/>
               </w:rPr>
-              <w:t>13</w:t>
+              <w:t>¡Error! Marcador no definido.</w:t>
             </w:r>
             <w:r>
               <w:rPr>
@@ -4079,19 +3885,11 @@
         </w:rPr>
         <w:t xml:space="preserve">Redacción alusiva al primer subtema de este capítulo. </w:t>
       </w:r>
-      <w:proofErr w:type="spellStart"/>
-      <w:r>
-        <w:rPr>
-          <w:rFonts w:ascii="Arial" w:hAnsi="Arial" w:cs="Arial"/>
-        </w:rPr>
-        <w:t>JkadkjfhkhdsfkDFLKLKJdklfj</w:t>
-      </w:r>
-      <w:proofErr w:type="spellEnd"/>
-      <w:r>
-        <w:rPr>
-          <w:rFonts w:ascii="Arial" w:hAnsi="Arial" w:cs="Arial"/>
-        </w:rPr>
-        <w:t>.</w:t>
+      <w:r>
+        <w:rPr>
+          <w:rFonts w:ascii="Arial" w:hAnsi="Arial" w:cs="Arial"/>
+        </w:rPr>
+        <w:t>JkadkjfhkhdsfkDFLKLKJdklfj.</w:t>
       </w:r>
     </w:p>
     <w:p>
@@ -4112,65 +3910,8 @@
           <w:rFonts w:ascii="Arial" w:hAnsi="Arial" w:cs="Arial"/>
         </w:rPr>
         <w:tab/>
-      </w:r>
-      <w:proofErr w:type="gramStart"/>
-      <w:r>
-        <w:rPr>
-          <w:rFonts w:ascii="Arial" w:hAnsi="Arial" w:cs="Arial"/>
-        </w:rPr>
-        <w:t>Nfdkjdksfjng.nsfd.gn .</w:t>
-      </w:r>
-      <w:proofErr w:type="spellStart"/>
-      <w:r>
-        <w:rPr>
-          <w:rFonts w:ascii="Arial" w:hAnsi="Arial" w:cs="Arial"/>
-        </w:rPr>
-        <w:t>lnkfglkfg</w:t>
-      </w:r>
-      <w:proofErr w:type="spellEnd"/>
-      <w:proofErr w:type="gramEnd"/>
-      <w:r>
-        <w:rPr>
-          <w:rFonts w:ascii="Arial" w:hAnsi="Arial" w:cs="Arial"/>
-        </w:rPr>
-        <w:t xml:space="preserve"> </w:t>
-      </w:r>
-      <w:proofErr w:type="spellStart"/>
-      <w:r>
-        <w:rPr>
-          <w:rFonts w:ascii="Arial" w:hAnsi="Arial" w:cs="Arial"/>
-        </w:rPr>
-        <w:t>lkdjfgñlkjsdñflkgjlkjfdg</w:t>
-      </w:r>
-      <w:proofErr w:type="spellEnd"/>
-      <w:r>
-        <w:rPr>
-          <w:rFonts w:ascii="Arial" w:hAnsi="Arial" w:cs="Arial"/>
-        </w:rPr>
-        <w:t xml:space="preserve"> </w:t>
-      </w:r>
-      <w:proofErr w:type="spellStart"/>
-      <w:r>
-        <w:rPr>
-          <w:rFonts w:ascii="Arial" w:hAnsi="Arial" w:cs="Arial"/>
-        </w:rPr>
-        <w:t>ñlsdjfglkjfdlkgj</w:t>
-      </w:r>
-      <w:proofErr w:type="spellEnd"/>
-      <w:r>
-        <w:rPr>
-          <w:rFonts w:ascii="Arial" w:hAnsi="Arial" w:cs="Arial"/>
-        </w:rPr>
-        <w:t xml:space="preserve"> </w:t>
-      </w:r>
-      <w:proofErr w:type="spellStart"/>
-      <w:r>
-        <w:rPr>
-          <w:rFonts w:ascii="Arial" w:hAnsi="Arial" w:cs="Arial"/>
-        </w:rPr>
-        <w:t>lkjglkjslkjg</w:t>
-      </w:r>
-      <w:proofErr w:type="spellEnd"/>
+        <w:t>Nfdkjdksfjng.nsfd.gn .lnkfglkfg lkdjfgñlkjsdñflkgjlkjfdg ñlsdjfglkjfdlkgj lkjglkjslkjg</w:t>
+      </w:r>
     </w:p>
     <w:p>
       <w:pPr>
@@ -4198,14 +3939,12 @@
         </w:rPr>
         <w:t>1.1.1</w:t>
       </w:r>
-      <w:proofErr w:type="gramStart"/>
       <w:r>
         <w:rPr>
           <w:rFonts w:ascii="Arial" w:hAnsi="Arial" w:cs="Arial"/>
         </w:rPr>
         <w:t xml:space="preserve">   (</w:t>
       </w:r>
-      <w:proofErr w:type="gramEnd"/>
       <w:r>
         <w:rPr>
           <w:rFonts w:ascii="Arial" w:hAnsi="Arial" w:cs="Arial"/>
@@ -4289,19 +4028,11 @@
         </w:rPr>
         <w:t xml:space="preserve">Redacción alusiva al primer subtema de este capítulo. </w:t>
       </w:r>
-      <w:proofErr w:type="spellStart"/>
-      <w:r>
-        <w:rPr>
-          <w:rFonts w:ascii="Arial" w:hAnsi="Arial" w:cs="Arial"/>
-        </w:rPr>
-        <w:t>JkadkjfhkhdsfkDFLKLKJdklfj</w:t>
-      </w:r>
-      <w:proofErr w:type="spellEnd"/>
-      <w:r>
-        <w:rPr>
-          <w:rFonts w:ascii="Arial" w:hAnsi="Arial" w:cs="Arial"/>
-        </w:rPr>
-        <w:t>.</w:t>
+      <w:r>
+        <w:rPr>
+          <w:rFonts w:ascii="Arial" w:hAnsi="Arial" w:cs="Arial"/>
+        </w:rPr>
+        <w:t>JkadkjfhkhdsfkDFLKLKJdklfj.</w:t>
       </w:r>
     </w:p>
     <w:p>
@@ -4515,14 +4246,12 @@
         </w:rPr>
         <w:t>2.1.1</w:t>
       </w:r>
-      <w:proofErr w:type="gramStart"/>
       <w:r>
         <w:rPr>
           <w:rFonts w:ascii="Arial" w:hAnsi="Arial" w:cs="Arial"/>
         </w:rPr>
         <w:t xml:space="preserve">   (</w:t>
       </w:r>
-      <w:proofErr w:type="gramEnd"/>
       <w:r>
         <w:rPr>
           <w:rFonts w:ascii="Arial" w:hAnsi="Arial" w:cs="Arial"/>
@@ -4587,8 +4316,8 @@
         <w:spacing w:line="480" w:lineRule="auto"/>
         <w:jc w:val="center"/>
       </w:pPr>
-      <w:bookmarkStart w:id="1" w:name="_Toc124250610"/>
-      <w:bookmarkStart w:id="2" w:name="_Toc124250611"/>
+      <w:bookmarkStart w:id="1" w:name="_Toc124250611"/>
+      <w:bookmarkStart w:id="2" w:name="_Toc124250610"/>
     </w:p>
     <w:p>
       <w:pPr>
@@ -4935,47 +4664,11 @@
         </w:rPr>
         <w:t>(</w:t>
       </w:r>
-      <w:proofErr w:type="spellStart"/>
-      <w:r>
-        <w:rPr>
-          <w:rFonts w:ascii="Arial" w:hAnsi="Arial" w:cs="Arial"/>
-        </w:rPr>
-        <w:t>United</w:t>
-      </w:r>
-      <w:proofErr w:type="spellEnd"/>
-      <w:r>
-        <w:rPr>
-          <w:rFonts w:ascii="Arial" w:hAnsi="Arial" w:cs="Arial"/>
-        </w:rPr>
-        <w:t xml:space="preserve"> Nations Office </w:t>
-      </w:r>
-      <w:proofErr w:type="spellStart"/>
-      <w:r>
-        <w:rPr>
-          <w:rFonts w:ascii="Arial" w:hAnsi="Arial" w:cs="Arial"/>
-        </w:rPr>
-        <w:t>on</w:t>
-      </w:r>
-      <w:proofErr w:type="spellEnd"/>
-      <w:r>
-        <w:rPr>
-          <w:rFonts w:ascii="Arial" w:hAnsi="Arial" w:cs="Arial"/>
-        </w:rPr>
-        <w:t xml:space="preserve"> Drugs and </w:t>
-      </w:r>
-      <w:proofErr w:type="spellStart"/>
-      <w:r>
-        <w:rPr>
-          <w:rFonts w:ascii="Arial" w:hAnsi="Arial" w:cs="Arial"/>
-        </w:rPr>
-        <w:t>Crime</w:t>
-      </w:r>
-      <w:proofErr w:type="spellEnd"/>
-      <w:r>
-        <w:rPr>
-          <w:rFonts w:ascii="Arial" w:hAnsi="Arial" w:cs="Arial"/>
-        </w:rPr>
-        <w:t xml:space="preserve"> </w:t>
+      <w:r>
+        <w:rPr>
+          <w:rFonts w:ascii="Arial" w:hAnsi="Arial" w:cs="Arial"/>
+        </w:rPr>
+        <w:t xml:space="preserve">United Nations Office on Drugs and Crime </w:t>
       </w:r>
       <w:r>
         <w:rPr>
@@ -5066,79 +4759,242 @@
           <w:rFonts w:ascii="Arial" w:hAnsi="Arial" w:cs="Arial"/>
         </w:rPr>
         <w:lastRenderedPageBreak/>
-        <w:t>proliferación de armas de destrucción masiva, y sus recomendaciones son reconocidas como el estándar global en la materia (</w:t>
-      </w:r>
-      <w:proofErr w:type="spellStart"/>
-      <w:r>
-        <w:rPr>
-          <w:rFonts w:ascii="Arial" w:hAnsi="Arial" w:cs="Arial"/>
-        </w:rPr>
-        <w:t>Financial</w:t>
-      </w:r>
-      <w:proofErr w:type="spellEnd"/>
+        <w:t>proliferación de armas de destrucción masiva, y sus recomendaciones son reconocidas como el estándar global en la materia (Financial Action Task Force [FATF], 202</w:t>
+      </w:r>
+      <w:r>
+        <w:rPr>
+          <w:rFonts w:ascii="Arial" w:hAnsi="Arial" w:cs="Arial"/>
+        </w:rPr>
+        <w:t>2</w:t>
+      </w:r>
+      <w:r>
+        <w:rPr>
+          <w:rFonts w:ascii="Arial" w:hAnsi="Arial" w:cs="Arial"/>
+        </w:rPr>
+        <w:t xml:space="preserve">). </w:t>
+      </w:r>
+      <w:r>
+        <w:rPr>
+          <w:rFonts w:ascii="Arial" w:hAnsi="Arial" w:cs="Arial"/>
+        </w:rPr>
+        <w:t>Los avances normativos son notables: el cumplimiento técnico de las jurisdicciones evaluadas pasó de 36% en 20</w:t>
+      </w:r>
+      <w:r>
+        <w:rPr>
+          <w:rFonts w:ascii="Arial" w:hAnsi="Arial" w:cs="Arial"/>
+        </w:rPr>
+        <w:t>12</w:t>
+      </w:r>
+      <w:r>
+        <w:rPr>
+          <w:rFonts w:ascii="Arial" w:hAnsi="Arial" w:cs="Arial"/>
+        </w:rPr>
+        <w:t xml:space="preserve"> a 76% (FATF,</w:t>
+      </w:r>
       <w:r>
         <w:rPr>
           <w:rFonts w:ascii="Arial" w:hAnsi="Arial" w:cs="Arial"/>
         </w:rPr>
         <w:t xml:space="preserve"> </w:t>
       </w:r>
-      <w:proofErr w:type="spellStart"/>
-      <w:r>
-        <w:rPr>
-          <w:rFonts w:ascii="Arial" w:hAnsi="Arial" w:cs="Arial"/>
-        </w:rPr>
-        <w:t>Action</w:t>
-      </w:r>
-      <w:proofErr w:type="spellEnd"/>
+      <w:r>
+        <w:rPr>
+          <w:rFonts w:ascii="Arial" w:hAnsi="Arial" w:cs="Arial"/>
+        </w:rPr>
+        <w:t>2022, p.5). Sin embargo, solo el 21% alcanza un nivel promedio de efectividad alto o sustancial (FATF,</w:t>
+      </w:r>
       <w:r>
         <w:rPr>
           <w:rFonts w:ascii="Arial" w:hAnsi="Arial" w:cs="Arial"/>
         </w:rPr>
         <w:t xml:space="preserve"> </w:t>
       </w:r>
-      <w:proofErr w:type="spellStart"/>
-      <w:r>
-        <w:rPr>
-          <w:rFonts w:ascii="Arial" w:hAnsi="Arial" w:cs="Arial"/>
-        </w:rPr>
-        <w:t>Task</w:t>
-      </w:r>
-      <w:proofErr w:type="spellEnd"/>
-      <w:r>
-        <w:rPr>
-          <w:rFonts w:ascii="Arial" w:hAnsi="Arial" w:cs="Arial"/>
-        </w:rPr>
-        <w:t xml:space="preserve"> Force [FATF], 202</w:t>
-      </w:r>
-      <w:r>
-        <w:rPr>
-          <w:rFonts w:ascii="Arial" w:hAnsi="Arial" w:cs="Arial"/>
-        </w:rPr>
-        <w:t>2</w:t>
-      </w:r>
-      <w:r>
-        <w:rPr>
-          <w:rFonts w:ascii="Arial" w:hAnsi="Arial" w:cs="Arial"/>
-        </w:rPr>
-        <w:t xml:space="preserve">). </w:t>
-      </w:r>
-      <w:r>
-        <w:rPr>
-          <w:rFonts w:ascii="Arial" w:hAnsi="Arial" w:cs="Arial"/>
-        </w:rPr>
-        <w:t>Los avances normativos son notables: el cumplimiento técnico de las jurisdicciones evaluadas pasó de 36% en 20</w:t>
-      </w:r>
-      <w:r>
-        <w:rPr>
-          <w:rFonts w:ascii="Arial" w:hAnsi="Arial" w:cs="Arial"/>
-        </w:rPr>
-        <w:t>12</w:t>
-      </w:r>
-      <w:r>
-        <w:rPr>
-          <w:rFonts w:ascii="Arial" w:hAnsi="Arial" w:cs="Arial"/>
-        </w:rPr>
-        <w:t xml:space="preserve"> a 76% (FATF,</w:t>
+      <w:r>
+        <w:rPr>
+          <w:rFonts w:ascii="Arial" w:hAnsi="Arial" w:cs="Arial"/>
+        </w:rPr>
+        <w:t xml:space="preserve">2022, p.11). </w:t>
+      </w:r>
+      <w:r>
+        <w:rPr>
+          <w:rFonts w:ascii="Arial" w:hAnsi="Arial" w:cs="Arial"/>
+        </w:rPr>
+        <w:t>Por lo tanto, t</w:t>
+      </w:r>
+      <w:r>
+        <w:rPr>
+          <w:rFonts w:ascii="Arial" w:hAnsi="Arial" w:cs="Arial"/>
+        </w:rPr>
+        <w:t xml:space="preserve">ener normas no garantiza que funcionen, y ello vuelve decisivo el instrumento con el que las instituciones identifican las operaciones sospechosas. Durante décadas ese instrumento fueron reglas fijas con umbrales predefinidos, pero la disponibilidad </w:t>
+      </w:r>
+      <w:r>
+        <w:rPr>
+          <w:rFonts w:ascii="Arial" w:hAnsi="Arial" w:cs="Arial"/>
+        </w:rPr>
+        <w:t>de</w:t>
+      </w:r>
+      <w:r>
+        <w:rPr>
+          <w:rFonts w:ascii="Arial" w:hAnsi="Arial" w:cs="Arial"/>
+        </w:rPr>
+        <w:t xml:space="preserve"> grandes bases de datos, el mayor poder de cómputo y el desarrollo de paquetes de software llevaron a incorporar técnicas de inteligencia artificial para superar </w:t>
+      </w:r>
+      <w:r>
+        <w:rPr>
+          <w:rFonts w:ascii="Arial" w:hAnsi="Arial" w:cs="Arial"/>
+        </w:rPr>
+        <w:t>las deficiencias</w:t>
+      </w:r>
+      <w:r>
+        <w:rPr>
+          <w:rFonts w:ascii="Arial" w:hAnsi="Arial" w:cs="Arial"/>
+        </w:rPr>
+        <w:t xml:space="preserve"> de los métodos tradicionales (Rocha-Salazar et ál., 2021). </w:t>
+      </w:r>
+    </w:p>
+    <w:p>
+      <w:pPr>
+        <w:spacing w:line="360" w:lineRule="auto"/>
+        <w:jc w:val="both"/>
+        <w:rPr>
+          <w:rFonts w:ascii="Arial" w:hAnsi="Arial" w:cs="Arial"/>
+        </w:rPr>
+      </w:pPr>
+    </w:p>
+    <w:p>
+      <w:pPr>
+        <w:spacing w:line="360" w:lineRule="auto"/>
+        <w:jc w:val="both"/>
+        <w:rPr>
+          <w:rFonts w:ascii="Arial" w:hAnsi="Arial" w:cs="Arial"/>
+        </w:rPr>
+      </w:pPr>
+      <w:r>
+        <w:rPr>
+          <w:rFonts w:ascii="Arial" w:hAnsi="Arial" w:cs="Arial"/>
+        </w:rPr>
+        <w:t xml:space="preserve">           </w:t>
+      </w:r>
+      <w:r>
+        <w:rPr>
+          <w:rFonts w:ascii="Arial" w:hAnsi="Arial" w:cs="Arial"/>
+        </w:rPr>
+        <w:t>Este esfuerzo internacional se vio reflejado en México de manera gradual: en 1990 se incorporó el delito de lavado de dinero al Código Fiscal de la Federación, se emitieron las primeras disposiciones generales para el sistema financiero y, en 2000, el país ingresó como miembro de pleno derecho al GAFI (Núñez Camacho, 2008, pp. xxi-xxii)</w:t>
+      </w:r>
+      <w:r>
+        <w:rPr>
+          <w:rFonts w:ascii="Arial" w:hAnsi="Arial" w:cs="Arial"/>
+        </w:rPr>
+        <w:t xml:space="preserve">. </w:t>
+      </w:r>
+      <w:r>
+        <w:rPr>
+          <w:rFonts w:ascii="Arial" w:hAnsi="Arial" w:cs="Arial"/>
+        </w:rPr>
+        <w:t>En la actualidad</w:t>
+      </w:r>
+      <w:r>
+        <w:rPr>
+          <w:rFonts w:ascii="Arial" w:hAnsi="Arial" w:cs="Arial"/>
+        </w:rPr>
+        <w:t>, el marco institucional integra a la Secretaría de Hacienda y Crédito Público, por medio de la Unidad de Inteligencia Financiera (UIF), al Banco de México y a los supervisores del sistema financiero, entre ellos la Comisión Nacional Bancaria y de Valores (CNBV) (UIF, 2023, pp. 10-11). Para las instituciones financieras</w:t>
+      </w:r>
+      <w:r>
+        <w:rPr>
+          <w:rFonts w:ascii="Arial" w:hAnsi="Arial" w:cs="Arial"/>
+        </w:rPr>
+        <w:t xml:space="preserve"> en México</w:t>
+      </w:r>
+      <w:r>
+        <w:rPr>
+          <w:rFonts w:ascii="Arial" w:hAnsi="Arial" w:cs="Arial"/>
+        </w:rPr>
+        <w:t>, ese marco se traduce en la obligación de contar con sistemas automatizados que detecten y monitoreen operaciones, generen alertas y sustenten el reporte de operaciones inusuales (CNBV, 2017, diap. 25 y 31). Sin embargo, la Evaluación Nacional de Riesgos reconoce deficiencias en estos sistemas, principalmente en la parametrización de sus escenarios de alerta (UIF, 2023, p. 23).</w:t>
+      </w:r>
+    </w:p>
+    <w:p>
+      <w:pPr>
+        <w:spacing w:line="360" w:lineRule="auto"/>
+        <w:jc w:val="both"/>
+        <w:rPr>
+          <w:rFonts w:ascii="Arial" w:hAnsi="Arial" w:cs="Arial"/>
+        </w:rPr>
+      </w:pPr>
+    </w:p>
+    <w:p>
+      <w:pPr>
+        <w:spacing w:line="360" w:lineRule="auto"/>
+        <w:jc w:val="both"/>
+        <w:rPr>
+          <w:rFonts w:ascii="Arial" w:hAnsi="Arial" w:cs="Arial"/>
+        </w:rPr>
+      </w:pPr>
+      <w:r>
+        <w:rPr>
+          <w:rFonts w:ascii="Arial" w:hAnsi="Arial" w:cs="Arial"/>
+        </w:rPr>
+        <w:lastRenderedPageBreak/>
+        <w:t xml:space="preserve">          </w:t>
+      </w:r>
+      <w:r>
+        <w:rPr>
+          <w:rFonts w:ascii="Arial" w:hAnsi="Arial" w:cs="Arial"/>
+        </w:rPr>
+        <w:t>Las deficiencias señaladas en la configuración de las alertas no son el único riesgo: aun configurad</w:t>
+      </w:r>
+      <w:r>
+        <w:rPr>
+          <w:rFonts w:ascii="Arial" w:hAnsi="Arial" w:cs="Arial"/>
+        </w:rPr>
+        <w:t>a</w:t>
+      </w:r>
+      <w:r>
+        <w:rPr>
+          <w:rFonts w:ascii="Arial" w:hAnsi="Arial" w:cs="Arial"/>
+        </w:rPr>
+        <w:t>s</w:t>
+      </w:r>
+      <w:r>
+        <w:rPr>
+          <w:rFonts w:ascii="Arial" w:hAnsi="Arial" w:cs="Arial"/>
+        </w:rPr>
+        <w:t xml:space="preserve"> bien</w:t>
+      </w:r>
+      <w:r>
+        <w:rPr>
+          <w:rFonts w:ascii="Arial" w:hAnsi="Arial" w:cs="Arial"/>
+        </w:rPr>
+        <w:t xml:space="preserve">, los modelos que detectan operaciones sospechosas pierden eficacia con el tiempo, porque cambian los datos y también las formas de operar de quienes lavan dinero (Gama et ál., 2014; Rocha-Salazar et ál., 2021). Además, </w:t>
+      </w:r>
+      <w:r>
+        <w:rPr>
+          <w:rFonts w:ascii="Arial" w:hAnsi="Arial" w:cs="Arial"/>
+        </w:rPr>
+        <w:t>hay que confirmar</w:t>
+      </w:r>
+      <w:r>
+        <w:rPr>
+          <w:rFonts w:ascii="Arial" w:hAnsi="Arial" w:cs="Arial"/>
+        </w:rPr>
+        <w:t xml:space="preserve"> que una operación fue realmente lavado de dinero</w:t>
+      </w:r>
+      <w:r>
+        <w:rPr>
+          <w:rFonts w:ascii="Arial" w:hAnsi="Arial" w:cs="Arial"/>
+        </w:rPr>
+        <w:t xml:space="preserve"> y esto</w:t>
+      </w:r>
+      <w:r>
+        <w:rPr>
+          <w:rFonts w:ascii="Arial" w:hAnsi="Arial" w:cs="Arial"/>
+        </w:rPr>
+        <w:t xml:space="preserve"> puede tardar meses, por lo que esa pérdida suele notarse tarde (Sethi et ál., 2026)</w:t>
+      </w:r>
+      <w:r>
+        <w:rPr>
+          <w:rFonts w:ascii="Arial" w:hAnsi="Arial" w:cs="Arial"/>
+        </w:rPr>
+        <w:t>.</w:t>
       </w:r>
       <w:r>
         <w:rPr>
@@ -5150,7 +5006,13 @@
         <w:rPr>
           <w:rFonts w:ascii="Arial" w:hAnsi="Arial" w:cs="Arial"/>
         </w:rPr>
-        <w:t>2022, p.5). Sin embargo, solo el 21% alcanza un nivel promedio de efectividad alto o sustancial (FATF,</w:t>
+        <w:t xml:space="preserve">Esto plantea dos necesidades: detectar a tiempo que un modelo dejó de funcionar como se espera y comprender a qué se debe, para poder actuar. </w:t>
+      </w:r>
+      <w:r>
+        <w:rPr>
+          <w:rFonts w:ascii="Arial" w:hAnsi="Arial" w:cs="Arial"/>
+        </w:rPr>
+        <w:t>Atenderlas implica examinar evidencia y razonar sobre ella, labor en la que los agentes de inteligencia artificial, programas capaces de consultar herramientas de análisis y de razonar sobre sus resultados, han mostrado utilidad para diagnosticar fallas en plataformas en la nube (Wang et ál., 2024).</w:t>
       </w:r>
       <w:r>
         <w:rPr>
@@ -5162,53 +5024,58 @@
         <w:rPr>
           <w:rFonts w:ascii="Arial" w:hAnsi="Arial" w:cs="Arial"/>
         </w:rPr>
-        <w:t xml:space="preserve">2022, p.11). </w:t>
-      </w:r>
-      <w:r>
-        <w:rPr>
-          <w:rFonts w:ascii="Arial" w:hAnsi="Arial" w:cs="Arial"/>
-        </w:rPr>
-        <w:t>Por lo tanto, t</w:t>
-      </w:r>
-      <w:r>
-        <w:rPr>
-          <w:rFonts w:ascii="Arial" w:hAnsi="Arial" w:cs="Arial"/>
-        </w:rPr>
-        <w:t xml:space="preserve">ener normas no garantiza que funcionen, y ello vuelve decisivo el instrumento con el que las instituciones identifican las operaciones sospechosas. Durante décadas ese instrumento fueron reglas fijas con umbrales predefinidos, pero la disponibilidad </w:t>
-      </w:r>
-      <w:r>
-        <w:rPr>
-          <w:rFonts w:ascii="Arial" w:hAnsi="Arial" w:cs="Arial"/>
-        </w:rPr>
-        <w:t>de</w:t>
-      </w:r>
-      <w:r>
-        <w:rPr>
-          <w:rFonts w:ascii="Arial" w:hAnsi="Arial" w:cs="Arial"/>
-        </w:rPr>
-        <w:t xml:space="preserve"> grandes bases de datos, el mayor poder de cómputo y el desarrollo de paquetes de software llevaron a incorporar técnicas de inteligencia artificial para superar </w:t>
-      </w:r>
-      <w:r>
-        <w:rPr>
-          <w:rFonts w:ascii="Arial" w:hAnsi="Arial" w:cs="Arial"/>
-        </w:rPr>
-        <w:t>las deficiencias</w:t>
-      </w:r>
-      <w:r>
-        <w:rPr>
-          <w:rFonts w:ascii="Arial" w:hAnsi="Arial" w:cs="Arial"/>
-        </w:rPr>
-        <w:t xml:space="preserve"> de los métodos tradicionales (Rocha-Salazar et ál., 2021). </w:t>
-      </w:r>
-    </w:p>
-    <w:bookmarkEnd w:id="1"/>
-    <w:p>
-      <w:pPr>
-        <w:rPr>
-          <w:b/>
-          <w:bCs/>
-        </w:rPr>
-      </w:pPr>
+        <w:t>Por ello, este trabajo se delimita a vigilar un modelo de detección de lavado de dinero, avisar cuándo pierde eficacia y explicar su causa mediante agentes de inteligencia artificial, y a contrastarlo con el monitoreo tradicional</w:t>
+      </w:r>
+      <w:r>
+        <w:rPr>
+          <w:rFonts w:ascii="Arial" w:hAnsi="Arial" w:cs="Arial"/>
+        </w:rPr>
+        <w:t>, basado en reglas y umbrales fijos</w:t>
+      </w:r>
+      <w:r>
+        <w:rPr>
+          <w:rFonts w:ascii="Arial" w:hAnsi="Arial" w:cs="Arial"/>
+        </w:rPr>
+        <w:t>; quedan fuera el financiamiento al terrorismo, la modificación automática del modelo y el reporte de operaciones a la autoridad.</w:t>
+      </w:r>
+      <w:r>
+        <w:rPr>
+          <w:rFonts w:ascii="Arial" w:hAnsi="Arial" w:cs="Arial"/>
+        </w:rPr>
+        <w:t xml:space="preserve"> </w:t>
+      </w:r>
+      <w:r>
+        <w:rPr>
+          <w:rFonts w:ascii="Arial" w:hAnsi="Arial" w:cs="Arial"/>
+        </w:rPr>
+        <w:t xml:space="preserve">De ahí surge la siguiente pregunta de investigación: </w:t>
+      </w:r>
+    </w:p>
+    <w:p>
+      <w:pPr>
+        <w:spacing w:line="360" w:lineRule="auto"/>
+        <w:jc w:val="both"/>
+        <w:rPr>
+          <w:rFonts w:ascii="Arial" w:hAnsi="Arial" w:cs="Arial"/>
+        </w:rPr>
+      </w:pPr>
+    </w:p>
+    <w:bookmarkEnd w:id="2"/>
+    <w:p>
+      <w:pPr>
+        <w:spacing w:line="360" w:lineRule="auto"/>
+        <w:jc w:val="both"/>
+        <w:rPr>
+          <w:b/>
+          <w:bCs/>
+        </w:rPr>
+      </w:pPr>
+      <w:r>
+        <w:rPr>
+          <w:rFonts w:ascii="Arial" w:hAnsi="Arial" w:cs="Arial"/>
+        </w:rPr>
+        <w:t>¿En qué medida un sistema de agentes de inteligencia artificial puede detectar a tiempo y explicar la pérdida de eficacia de un modelo de detección de lavado de dinero, en comparación con el monitoreo tradicional?</w:t>
+      </w:r>
       <w:r>
         <w:rPr>
           <w:b/>
@@ -5500,14 +5367,12 @@
         </w:rPr>
         <w:t>1.1.1</w:t>
       </w:r>
-      <w:proofErr w:type="gramStart"/>
       <w:r>
         <w:rPr>
           <w:rFonts w:ascii="Arial" w:hAnsi="Arial" w:cs="Arial"/>
         </w:rPr>
         <w:t xml:space="preserve">   (</w:t>
       </w:r>
-      <w:proofErr w:type="gramEnd"/>
       <w:r>
         <w:rPr>
           <w:rFonts w:ascii="Arial" w:hAnsi="Arial" w:cs="Arial"/>
@@ -5598,14 +5463,12 @@
         </w:rPr>
         <w:t>1.1.1.1</w:t>
       </w:r>
-      <w:proofErr w:type="gramStart"/>
       <w:r>
         <w:rPr>
           <w:rFonts w:ascii="Arial" w:hAnsi="Arial" w:cs="Arial"/>
         </w:rPr>
         <w:t xml:space="preserve">   (</w:t>
       </w:r>
-      <w:proofErr w:type="gramEnd"/>
       <w:r>
         <w:rPr>
           <w:rFonts w:ascii="Arial" w:hAnsi="Arial" w:cs="Arial"/>
@@ -5724,7 +5587,7 @@
         </w:rPr>
       </w:pPr>
       <w:bookmarkStart w:id="3" w:name="_Toc124250613"/>
-      <w:bookmarkEnd w:id="2"/>
+      <w:bookmarkEnd w:id="1"/>
       <w:r>
         <w:rPr>
           <w:rFonts w:ascii="Arial" w:hAnsi="Arial" w:cs="Arial"/>
@@ -6321,14 +6184,12 @@
         </w:rPr>
         <w:t>1.1.1</w:t>
       </w:r>
-      <w:proofErr w:type="gramStart"/>
       <w:r>
         <w:rPr>
           <w:rFonts w:ascii="Arial" w:hAnsi="Arial" w:cs="Arial"/>
         </w:rPr>
         <w:t xml:space="preserve">   (</w:t>
       </w:r>
-      <w:proofErr w:type="gramEnd"/>
       <w:r>
         <w:rPr>
           <w:rFonts w:ascii="Arial" w:hAnsi="Arial" w:cs="Arial"/>
@@ -6744,14 +6605,12 @@
         </w:rPr>
         <w:t>1.1.1</w:t>
       </w:r>
-      <w:proofErr w:type="gramStart"/>
       <w:r>
         <w:rPr>
           <w:rFonts w:ascii="Arial" w:hAnsi="Arial" w:cs="Arial"/>
         </w:rPr>
         <w:t xml:space="preserve">   (</w:t>
       </w:r>
-      <w:proofErr w:type="gramEnd"/>
       <w:r>
         <w:rPr>
           <w:rFonts w:ascii="Arial" w:hAnsi="Arial" w:cs="Arial"/>
@@ -7145,14 +7004,12 @@
         </w:rPr>
         <w:t>1.1.1</w:t>
       </w:r>
-      <w:proofErr w:type="gramStart"/>
       <w:r>
         <w:rPr>
           <w:rFonts w:ascii="Arial" w:hAnsi="Arial" w:cs="Arial"/>
         </w:rPr>
         <w:t xml:space="preserve">   (</w:t>
       </w:r>
-      <w:proofErr w:type="gramEnd"/>
       <w:r>
         <w:rPr>
           <w:rFonts w:ascii="Arial" w:hAnsi="Arial" w:cs="Arial"/>
@@ -7645,6 +7502,7 @@
         <w:jc w:val="both"/>
         <w:rPr>
           <w:rFonts w:ascii="Arial" w:hAnsi="Arial" w:cs="Arial"/>
+          <w:lang w:val="en-US"/>
         </w:rPr>
       </w:pPr>
       <w:r>
@@ -7665,7 +7523,14 @@
         <w:rPr>
           <w:rFonts w:ascii="Arial" w:hAnsi="Arial" w:cs="Arial"/>
         </w:rPr>
-        <w:t>. Aranzadi</w:t>
+        <w:t xml:space="preserve">. </w:t>
+      </w:r>
+      <w:r>
+        <w:rPr>
+          <w:rFonts w:ascii="Arial" w:hAnsi="Arial" w:cs="Arial"/>
+          <w:lang w:val="en-US"/>
+        </w:rPr>
+        <w:t>Aranzadi</w:t>
       </w:r>
     </w:p>
     <w:p>
@@ -7691,7 +7556,6 @@
         </w:rPr>
         <w:t xml:space="preserve">(s.f.). </w:t>
       </w:r>
-      <w:proofErr w:type="spellStart"/>
       <w:r>
         <w:rPr>
           <w:rFonts w:ascii="Arial" w:hAnsi="Arial" w:cs="Arial"/>
@@ -7700,7 +7564,6 @@
         </w:rPr>
         <w:t>Overview</w:t>
       </w:r>
-      <w:proofErr w:type="spellEnd"/>
       <w:r>
         <w:rPr>
           <w:rFonts w:ascii="Arial" w:hAnsi="Arial" w:cs="Arial"/>
@@ -7724,6 +7587,7 @@
           <w:rFonts w:ascii="Arial" w:hAnsi="Arial" w:cs="Arial"/>
           <w:i/>
           <w:iCs/>
+          <w:lang w:val="en-US"/>
         </w:rPr>
       </w:pPr>
       <w:r>
@@ -7744,62 +7608,9 @@
           <w:rFonts w:ascii="Arial" w:hAnsi="Arial" w:cs="Arial"/>
           <w:i/>
           <w:iCs/>
-        </w:rPr>
-        <w:t xml:space="preserve">Expert </w:t>
-      </w:r>
-      <w:proofErr w:type="spellStart"/>
-      <w:r>
-        <w:rPr>
-          <w:rFonts w:ascii="Arial" w:hAnsi="Arial" w:cs="Arial"/>
-          <w:i/>
-          <w:iCs/>
-        </w:rPr>
-        <w:t>Systems</w:t>
-      </w:r>
-      <w:proofErr w:type="spellEnd"/>
-      <w:r>
-        <w:rPr>
-          <w:rFonts w:ascii="Arial" w:hAnsi="Arial" w:cs="Arial"/>
-          <w:i/>
-          <w:iCs/>
-        </w:rPr>
-        <w:t xml:space="preserve"> </w:t>
-      </w:r>
-      <w:proofErr w:type="spellStart"/>
-      <w:r>
-        <w:rPr>
-          <w:rFonts w:ascii="Arial" w:hAnsi="Arial" w:cs="Arial"/>
-          <w:i/>
-          <w:iCs/>
-        </w:rPr>
-        <w:t>with</w:t>
-      </w:r>
-      <w:proofErr w:type="spellEnd"/>
-      <w:r>
-        <w:rPr>
-          <w:rFonts w:ascii="Arial" w:hAnsi="Arial" w:cs="Arial"/>
-          <w:i/>
-          <w:iCs/>
-        </w:rPr>
-        <w:t xml:space="preserve"> </w:t>
-      </w:r>
-      <w:proofErr w:type="spellStart"/>
-      <w:r>
-        <w:rPr>
-          <w:rFonts w:ascii="Arial" w:hAnsi="Arial" w:cs="Arial"/>
-          <w:i/>
-          <w:iCs/>
-        </w:rPr>
-        <w:t>Applications</w:t>
-      </w:r>
-      <w:proofErr w:type="spellEnd"/>
-      <w:r>
-        <w:rPr>
-          <w:rFonts w:ascii="Arial" w:hAnsi="Arial" w:cs="Arial"/>
-          <w:i/>
-          <w:iCs/>
-        </w:rPr>
-        <w:t>.</w:t>
+          <w:lang w:val="en-US"/>
+        </w:rPr>
+        <w:t>Expert Systems with Applications.</w:t>
       </w:r>
     </w:p>
     <w:p>
@@ -7835,6 +7646,257 @@
           <w:lang w:val="en-US"/>
         </w:rPr>
         <w:t>.</w:t>
+      </w:r>
+    </w:p>
+    <w:p>
+      <w:pPr>
+        <w:pStyle w:val="NormalWeb"/>
+        <w:spacing w:before="240" w:beforeAutospacing="0"/>
+        <w:ind w:left="567" w:hanging="567"/>
+        <w:jc w:val="both"/>
+        <w:rPr>
+          <w:rFonts w:ascii="Arial" w:hAnsi="Arial" w:cs="Arial"/>
+        </w:rPr>
+      </w:pPr>
+      <w:r>
+        <w:rPr>
+          <w:rFonts w:ascii="Arial" w:hAnsi="Arial" w:cs="Arial"/>
+        </w:rPr>
+        <w:t xml:space="preserve">Comisión Nacional Bancaria y de Valores. (2017). </w:t>
+      </w:r>
+      <w:r>
+        <w:rPr>
+          <w:rFonts w:ascii="Arial" w:hAnsi="Arial" w:cs="Arial"/>
+          <w:i/>
+          <w:iCs/>
+        </w:rPr>
+        <w:t>El lavado de dinero y el financiamiento al terrorismo</w:t>
+      </w:r>
+      <w:r>
+        <w:rPr>
+          <w:rFonts w:ascii="Arial" w:hAnsi="Arial" w:cs="Arial"/>
+        </w:rPr>
+        <w:t xml:space="preserve"> [Diapositivas de PowerPoint].</w:t>
+      </w:r>
+    </w:p>
+    <w:p>
+      <w:pPr>
+        <w:pStyle w:val="NormalWeb"/>
+        <w:spacing w:before="240" w:beforeAutospacing="0"/>
+        <w:ind w:left="567" w:hanging="567"/>
+        <w:jc w:val="both"/>
+        <w:rPr>
+          <w:rFonts w:ascii="Arial" w:hAnsi="Arial" w:cs="Arial"/>
+        </w:rPr>
+      </w:pPr>
+      <w:r>
+        <w:rPr>
+          <w:rFonts w:ascii="Arial" w:hAnsi="Arial" w:cs="Arial"/>
+        </w:rPr>
+        <w:t xml:space="preserve">Núñez Camacho, M. de la L. (2008). </w:t>
+      </w:r>
+      <w:r>
+        <w:rPr>
+          <w:rFonts w:ascii="Arial" w:hAnsi="Arial" w:cs="Arial"/>
+          <w:i/>
+          <w:iCs/>
+        </w:rPr>
+        <w:t>El fenómeno de lavado de dinero en México: Causas, efectos y propuestas para reforzar su combate</w:t>
+      </w:r>
+      <w:r>
+        <w:rPr>
+          <w:rFonts w:ascii="Arial" w:hAnsi="Arial" w:cs="Arial"/>
+        </w:rPr>
+        <w:t>. Porrúa.</w:t>
+      </w:r>
+    </w:p>
+    <w:p>
+      <w:pPr>
+        <w:pStyle w:val="NormalWeb"/>
+        <w:spacing w:before="240" w:beforeAutospacing="0"/>
+        <w:ind w:left="567" w:hanging="567"/>
+        <w:jc w:val="both"/>
+        <w:rPr>
+          <w:rFonts w:ascii="Arial" w:hAnsi="Arial" w:cs="Arial"/>
+          <w:i/>
+          <w:iCs/>
+        </w:rPr>
+      </w:pPr>
+      <w:r>
+        <w:rPr>
+          <w:rFonts w:ascii="Arial" w:hAnsi="Arial" w:cs="Arial"/>
+        </w:rPr>
+        <w:t xml:space="preserve">Unidad de Inteligencia Financiera. (2023). </w:t>
+      </w:r>
+      <w:r>
+        <w:rPr>
+          <w:rFonts w:ascii="Arial" w:hAnsi="Arial" w:cs="Arial"/>
+          <w:i/>
+          <w:iCs/>
+        </w:rPr>
+        <w:t>Evaluación nacional de riesgos de lavado de dinero y financiamiento al terrorismo 2023</w:t>
+      </w:r>
+      <w:r>
+        <w:rPr>
+          <w:rFonts w:ascii="Arial" w:hAnsi="Arial" w:cs="Arial"/>
+        </w:rPr>
+        <w:t>. Secretaría de Hacienda y Crédito Público.</w:t>
+      </w:r>
+    </w:p>
+    <w:p>
+      <w:pPr>
+        <w:pStyle w:val="NormalWeb"/>
+        <w:spacing w:before="240" w:beforeAutospacing="0"/>
+        <w:ind w:left="567" w:hanging="567"/>
+        <w:jc w:val="both"/>
+        <w:rPr>
+          <w:rFonts w:ascii="Arial" w:hAnsi="Arial" w:cs="Arial"/>
+          <w:lang w:val="en-US"/>
+        </w:rPr>
+      </w:pPr>
+      <w:r>
+        <w:rPr>
+          <w:rFonts w:ascii="Arial" w:hAnsi="Arial" w:cs="Arial"/>
+        </w:rPr>
+        <w:t xml:space="preserve">Gama, J., Žliobaitė, I., Bifet, A., Pechenizkiy, M. y Bouchachia, A. (2014). </w:t>
+      </w:r>
+      <w:r>
+        <w:rPr>
+          <w:rFonts w:ascii="Arial" w:hAnsi="Arial" w:cs="Arial"/>
+          <w:lang w:val="en-US"/>
+        </w:rPr>
+        <w:t xml:space="preserve">A survey on concept drift adaptation. </w:t>
+      </w:r>
+      <w:r>
+        <w:rPr>
+          <w:rFonts w:ascii="Arial" w:hAnsi="Arial" w:cs="Arial"/>
+          <w:i/>
+          <w:iCs/>
+          <w:lang w:val="en-US"/>
+        </w:rPr>
+        <w:t>ACM Computing Surveys, 46</w:t>
+      </w:r>
+      <w:r>
+        <w:rPr>
+          <w:rFonts w:ascii="Arial" w:hAnsi="Arial" w:cs="Arial"/>
+          <w:lang w:val="en-US"/>
+        </w:rPr>
+        <w:t>(4), Artículo 44.</w:t>
+      </w:r>
+    </w:p>
+    <w:p>
+      <w:pPr>
+        <w:pStyle w:val="NormalWeb"/>
+        <w:spacing w:before="240" w:beforeAutospacing="0"/>
+        <w:ind w:left="567" w:hanging="567"/>
+        <w:jc w:val="both"/>
+        <w:rPr>
+          <w:rFonts w:ascii="Arial" w:hAnsi="Arial" w:cs="Arial"/>
+        </w:rPr>
+      </w:pPr>
+      <w:r>
+        <w:rPr>
+          <w:rFonts w:ascii="Arial" w:hAnsi="Arial" w:cs="Arial"/>
+          <w:highlight w:val="yellow"/>
+          <w:lang w:val="en-US"/>
+        </w:rPr>
+        <w:t xml:space="preserve">Sethi, A., Gupta, P., Kansotia, S., Kant, K. y Srivasatava, N. (2026). Proactive detection of model degradation in financial fraud prediction with delayed </w:t>
+      </w:r>
+      <w:r>
+        <w:rPr>
+          <w:rFonts w:ascii="Arial" w:hAnsi="Arial" w:cs="Arial"/>
+          <w:highlight w:val="yellow"/>
+          <w:lang w:val="en-US"/>
+        </w:rPr>
+        <w:lastRenderedPageBreak/>
+        <w:t xml:space="preserve">labels. En </w:t>
+      </w:r>
+      <w:r>
+        <w:rPr>
+          <w:rFonts w:ascii="Arial" w:hAnsi="Arial" w:cs="Arial"/>
+          <w:i/>
+          <w:iCs/>
+          <w:highlight w:val="yellow"/>
+          <w:lang w:val="en-US"/>
+        </w:rPr>
+        <w:t>Machine learning and knowledge discovery in databases: Applied data science track (ECML PKDD 2025)</w:t>
+      </w:r>
+      <w:r>
+        <w:rPr>
+          <w:rFonts w:ascii="Arial" w:hAnsi="Arial" w:cs="Arial"/>
+          <w:highlight w:val="yellow"/>
+          <w:lang w:val="en-US"/>
+        </w:rPr>
+        <w:t xml:space="preserve"> (pp. 265-281). </w:t>
+      </w:r>
+      <w:r>
+        <w:rPr>
+          <w:rFonts w:ascii="Arial" w:hAnsi="Arial" w:cs="Arial"/>
+          <w:highlight w:val="yellow"/>
+        </w:rPr>
+        <w:t>Springer.</w:t>
+      </w:r>
+    </w:p>
+    <w:p>
+      <w:pPr>
+        <w:pStyle w:val="NormalWeb"/>
+        <w:spacing w:before="240" w:beforeAutospacing="0"/>
+        <w:ind w:left="567" w:hanging="567"/>
+        <w:jc w:val="both"/>
+        <w:rPr>
+          <w:rFonts w:ascii="Arial" w:hAnsi="Arial" w:cs="Arial"/>
+          <w:lang w:val="en-US"/>
+        </w:rPr>
+      </w:pPr>
+      <w:r>
+        <w:rPr>
+          <w:rFonts w:ascii="Arial" w:hAnsi="Arial" w:cs="Arial"/>
+          <w:lang w:val="en-US"/>
+        </w:rPr>
+        <w:t>Wang</w:t>
+      </w:r>
+      <w:r>
+        <w:rPr>
+          <w:rFonts w:ascii="Arial" w:hAnsi="Arial" w:cs="Arial"/>
+          <w:lang w:val="en-US"/>
+        </w:rPr>
+        <w:t xml:space="preserve">, </w:t>
+      </w:r>
+      <w:r>
+        <w:rPr>
+          <w:rFonts w:ascii="Arial" w:hAnsi="Arial" w:cs="Arial"/>
+          <w:lang w:val="en-US"/>
+        </w:rPr>
+        <w:t>Zefan</w:t>
+      </w:r>
+      <w:r>
+        <w:rPr>
+          <w:rFonts w:ascii="Arial" w:hAnsi="Arial" w:cs="Arial"/>
+          <w:lang w:val="en-US"/>
+        </w:rPr>
+        <w:t xml:space="preserve">., et ál. (2024). RCAgent: Cloud root cause analysis by autonomous agents with tool-augmented large language models. En </w:t>
+      </w:r>
+      <w:r>
+        <w:rPr>
+          <w:rFonts w:ascii="Arial" w:hAnsi="Arial" w:cs="Arial"/>
+          <w:i/>
+          <w:iCs/>
+          <w:lang w:val="en-US"/>
+        </w:rPr>
+        <w:t>Proceedings of the 33rd ACM International Conference on Information and Knowledge Management (CIKM '24)</w:t>
+      </w:r>
+      <w:r>
+        <w:rPr>
+          <w:rFonts w:ascii="Arial" w:hAnsi="Arial" w:cs="Arial"/>
+          <w:lang w:val="en-US"/>
+        </w:rPr>
+        <w:t xml:space="preserve">. </w:t>
+      </w:r>
+      <w:r>
+        <w:rPr>
+          <w:rFonts w:ascii="Arial" w:hAnsi="Arial" w:cs="Arial"/>
+        </w:rPr>
+        <w:t>ACM.</w:t>
       </w:r>
     </w:p>
     <w:p>
@@ -9892,6 +9954,23 @@
 </file>
 
 <file path=customXml/item1.xml><?xml version="1.0" encoding="utf-8"?>
+<p:properties xmlns:p="http://schemas.microsoft.com/office/2006/metadata/properties" xmlns:xsi="http://www.w3.org/2001/XMLSchema-instance" xmlns:pc="http://schemas.microsoft.com/office/infopath/2007/PartnerControls">
+  <documentManagement>
+    <ReferenceId xmlns="d921d922-e586-4070-94cf-401e9ff1332c" xsi:nil="true"/>
+  </documentManagement>
+</p:properties>
+</file>
+
+<file path=customXml/item2.xml><?xml version="1.0" encoding="utf-8"?>
+<?mso-contentType ?>
+<FormTemplates xmlns="http://schemas.microsoft.com/sharepoint/v3/contenttype/forms">
+  <Display>DocumentLibraryForm</Display>
+  <Edit>DocumentLibraryForm</Edit>
+  <New>DocumentLibraryForm</New>
+</FormTemplates>
+</file>
+
+<file path=customXml/item3.xml><?xml version="1.0" encoding="utf-8"?>
 <ct:contentTypeSchema xmlns:ct="http://schemas.microsoft.com/office/2006/metadata/contentType" xmlns:ma="http://schemas.microsoft.com/office/2006/metadata/properties/metaAttributes" ct:_="" ma:_="" ma:contentTypeName="Document" ma:contentTypeID="0x0101006AF304BD0D0B7C4698522C08709C00BB" ma:contentTypeVersion="4" ma:contentTypeDescription="Create a new document." ma:contentTypeScope="" ma:versionID="d87bf246123dbc96f665515db9402ea3">
   <xsd:schema xmlns:xsd="http://www.w3.org/2001/XMLSchema" xmlns:xs="http://www.w3.org/2001/XMLSchema" xmlns:p="http://schemas.microsoft.com/office/2006/metadata/properties" xmlns:ns2="d921d922-e586-4070-94cf-401e9ff1332c" targetNamespace="http://schemas.microsoft.com/office/2006/metadata/properties" ma:root="true" ma:fieldsID="814706c9f71ffcccbcbebef487bdee00" ns2:_="">
     <xsd:import namespace="d921d922-e586-4070-94cf-401e9ff1332c"/>
@@ -10035,24 +10114,25 @@
 </ct:contentTypeSchema>
 </file>
 
-<file path=customXml/item2.xml><?xml version="1.0" encoding="utf-8"?>
-<?mso-contentType ?>
-<FormTemplates xmlns="http://schemas.microsoft.com/sharepoint/v3/contenttype/forms">
-  <Display>DocumentLibraryForm</Display>
-  <Edit>DocumentLibraryForm</Edit>
-  <New>DocumentLibraryForm</New>
-</FormTemplates>
+<file path=customXml/itemProps1.xml><?xml version="1.0" encoding="utf-8"?>
+<ds:datastoreItem xmlns:ds="http://schemas.openxmlformats.org/officeDocument/2006/customXml" ds:itemID="{0A485150-6D8C-4680-B13D-3C6444219884}">
+  <ds:schemaRefs>
+    <ds:schemaRef ds:uri="http://schemas.microsoft.com/office/2006/metadata/properties"/>
+    <ds:schemaRef ds:uri="http://schemas.microsoft.com/office/infopath/2007/PartnerControls"/>
+    <ds:schemaRef ds:uri="d921d922-e586-4070-94cf-401e9ff1332c"/>
+  </ds:schemaRefs>
+</ds:datastoreItem>
 </file>
 
-<file path=customXml/item3.xml><?xml version="1.0" encoding="utf-8"?>
-<p:properties xmlns:p="http://schemas.microsoft.com/office/2006/metadata/properties" xmlns:xsi="http://www.w3.org/2001/XMLSchema-instance" xmlns:pc="http://schemas.microsoft.com/office/infopath/2007/PartnerControls">
-  <documentManagement>
-    <ReferenceId xmlns="d921d922-e586-4070-94cf-401e9ff1332c" xsi:nil="true"/>
-  </documentManagement>
-</p:properties>
+<file path=customXml/itemProps2.xml><?xml version="1.0" encoding="utf-8"?>
+<ds:datastoreItem xmlns:ds="http://schemas.openxmlformats.org/officeDocument/2006/customXml" ds:itemID="{C7DAC258-E4DA-446C-926C-E7A60E0F13CC}">
+  <ds:schemaRefs>
+    <ds:schemaRef ds:uri="http://schemas.microsoft.com/sharepoint/v3/contenttype/forms"/>
+  </ds:schemaRefs>
+</ds:datastoreItem>
 </file>
 
-<file path=customXml/itemProps1.xml><?xml version="1.0" encoding="utf-8"?>
+<file path=customXml/itemProps3.xml><?xml version="1.0" encoding="utf-8"?>
 <ds:datastoreItem xmlns:ds="http://schemas.openxmlformats.org/officeDocument/2006/customXml" ds:itemID="{66617E81-A932-4195-A0D0-208078D8F9E1}">
   <ds:schemaRefs>
     <ds:schemaRef ds:uri="http://schemas.microsoft.com/office/2006/metadata/contentType"/>
@@ -10068,22 +10148,4 @@
     <ds:schemaRef ds:uri="http://schemas.microsoft.com/internal/obd"/>
   </ds:schemaRefs>
 </ds:datastoreItem>
-</file>
-
-<file path=customXml/itemProps2.xml><?xml version="1.0" encoding="utf-8"?>
-<ds:datastoreItem xmlns:ds="http://schemas.openxmlformats.org/officeDocument/2006/customXml" ds:itemID="{C7DAC258-E4DA-446C-926C-E7A60E0F13CC}">
-  <ds:schemaRefs>
-    <ds:schemaRef ds:uri="http://schemas.microsoft.com/sharepoint/v3/contenttype/forms"/>
-  </ds:schemaRefs>
-</ds:datastoreItem>
-</file>
-
-<file path=customXml/itemProps3.xml><?xml version="1.0" encoding="utf-8"?>
-<ds:datastoreItem xmlns:ds="http://schemas.openxmlformats.org/officeDocument/2006/customXml" ds:itemID="{0A485150-6D8C-4680-B13D-3C6444219884}">
-  <ds:schemaRefs>
-    <ds:schemaRef ds:uri="http://schemas.microsoft.com/office/2006/metadata/properties"/>
-    <ds:schemaRef ds:uri="http://schemas.microsoft.com/office/infopath/2007/PartnerControls"/>
-    <ds:schemaRef ds:uri="d921d922-e586-4070-94cf-401e9ff1332c"/>
-  </ds:schemaRefs>
-</ds:datastoreItem>
 </file>
</xml_diff>